<commit_message>
feat: Random Forest on 6-year history with fair evaluation, report v10 update
- ML history starts in 2020 (2,276 days instead of 816); 2019 is incomplete
- Evaluation: outlier day capped with the training rule, MAPE on production
  days, new monthly volume gap metric
- Last-year (N-1) test removed: models ranked by cross-validation MAE
- Frontend: volume gap card and column, N-1 card and column removed
- Report: chapter 5 and related sections updated with the new results

Co-Authored-By: Claude Opus 5.5 <noreply@anthropic.com>
</commit_message>
<xml_diff>
--- a/pfe_v10.docx
+++ b/pfe_v10.docx
@@ -452,7 +452,7 @@
           <w:sz w:val="24"/>
           <w:szCs w:val="24"/>
         </w:rPr>
-        <w:t xml:space="preserve">La solution repose sur un entrepôt de données centralisé et un processus automatisé de collecte et de transformation des données. Elle s'articule autour de quatre piliers majeurs : l'ingénierie et l'assainissement automatisé des données d'atelier (ETL et Data Warehouse), le suivi des performances de production à travers des indicateurs industriels calculés directement sur l'entrepôt de données, la modélisation prédictive des cadences journalières avec sélection automatique du meilleur modèle, ainsi que l’optimisation intelligente de la gestion des stocks et la planification préventive des réapprovisionnements à 45 jours.</w:t>
+        <w:t xml:space="preserve">La solution repose sur un entrepôt de données centralisé et un processus automatisé de collecte et de transformation des données. Elle s'articule autour de quatre piliers majeurs : l'ingénierie et l'assainissement automatisé des données d'atelier (ETL et Data Warehouse), le suivi des performances de production à travers des indicateurs industriels calculés directement sur l'entrepôt de données, la modélisation prédictive des cadences journalières avec un modèle Random Forest retenu après comparaison de quatre modèles, ainsi que l’optimisation intelligente de la gestion des stocks et la planification préventive des réapprovisionnements à 45 jours.</w:t>
       </w:r>
     </w:p>
     <w:p>
@@ -607,7 +607,7 @@
           <w:sz w:val="24"/>
           <w:szCs w:val="24"/>
         </w:rPr>
-        <w:t xml:space="preserve">The platform relies on a centralized data warehouse and an automated Extract, Transform, Load (ETL) process to consolidate and prepare production data. It integrates four main pillars: automated data engineering and quality cleaning (ETL and Data Warehouse), production performance monitoring through industrial indicators, predictive modeling of daily workshop throughput with automatic selection of the best model, and intelligent inventory management with 45-day preventive replenishment planning.</w:t>
+        <w:t xml:space="preserve">The platform relies on a centralized data warehouse and an automated Extract, Transform, Load (ETL) process to consolidate and prepare production data. It integrates four main pillars: automated data engineering and quality cleaning (ETL and Data Warehouse), production performance monitoring through industrial indicators, predictive modeling of daily workshop throughput with a Random Forest model selected after comparing four models, and intelligent inventory management with 45-day preventive replenishment planning.</w:t>
       </w:r>
     </w:p>
     <w:p>
@@ -983,7 +983,7 @@
           <w:sz w:val="22"/>
           <w:szCs w:val="22"/>
         </w:rPr>
-        <w:t xml:space="preserve">4</w:t>
+        <w:t xml:space="preserve">3</w:t>
       </w:r>
     </w:p>
     <w:p>
@@ -1316,7 +1316,7 @@
           <w:sz w:val="22"/>
           <w:szCs w:val="22"/>
         </w:rPr>
-        <w:t xml:space="preserve">8</w:t>
+        <w:t xml:space="preserve">7</w:t>
       </w:r>
     </w:p>
     <w:p>
@@ -1353,7 +1353,7 @@
           <w:sz w:val="22"/>
           <w:szCs w:val="22"/>
         </w:rPr>
-        <w:t xml:space="preserve">9</w:t>
+        <w:t xml:space="preserve">8</w:t>
       </w:r>
     </w:p>
     <w:p>
@@ -1390,7 +1390,7 @@
           <w:sz w:val="22"/>
           <w:szCs w:val="22"/>
         </w:rPr>
-        <w:t xml:space="preserve">9</w:t>
+        <w:t xml:space="preserve">8</w:t>
       </w:r>
     </w:p>
     <w:p>
@@ -3457,7 +3457,7 @@
           <w:sz w:val="22"/>
           <w:szCs w:val="22"/>
         </w:rPr>
-        <w:t xml:space="preserve">36</w:t>
+        <w:t xml:space="preserve">35</w:t>
       </w:r>
     </w:p>
     <w:p>
@@ -3494,7 +3494,7 @@
           <w:sz w:val="22"/>
           <w:szCs w:val="22"/>
         </w:rPr>
-        <w:t xml:space="preserve">36</w:t>
+        <w:t xml:space="preserve">35</w:t>
       </w:r>
     </w:p>
     <w:p>
@@ -3568,7 +3568,7 @@
           <w:sz w:val="22"/>
           <w:szCs w:val="22"/>
         </w:rPr>
-        <w:t xml:space="preserve">37</w:t>
+        <w:t xml:space="preserve">36</w:t>
       </w:r>
     </w:p>
     <w:p>
@@ -3864,7 +3864,7 @@
           <w:sz w:val="22"/>
           <w:szCs w:val="22"/>
         </w:rPr>
-        <w:t xml:space="preserve">41</w:t>
+        <w:t xml:space="preserve">40</w:t>
       </w:r>
     </w:p>
     <w:p>
@@ -4012,7 +4012,7 @@
           <w:sz w:val="22"/>
           <w:szCs w:val="22"/>
         </w:rPr>
-        <w:t xml:space="preserve">44</w:t>
+        <w:t xml:space="preserve">43</w:t>
       </w:r>
     </w:p>
     <w:p>
@@ -4049,7 +4049,7 @@
           <w:sz w:val="22"/>
           <w:szCs w:val="22"/>
         </w:rPr>
-        <w:t xml:space="preserve">44</w:t>
+        <w:t xml:space="preserve">43</w:t>
       </w:r>
     </w:p>
     <w:p>
@@ -5314,7 +5314,7 @@
           <w:sz w:val="22"/>
           <w:szCs w:val="22"/>
         </w:rPr>
-        <w:t xml:space="preserve">42</w:t>
+        <w:t xml:space="preserve">41</w:t>
       </w:r>
     </w:p>
     <w:p>
@@ -5351,7 +5351,7 @@
           <w:sz w:val="22"/>
           <w:szCs w:val="22"/>
         </w:rPr>
-        <w:t xml:space="preserve">43</w:t>
+        <w:t xml:space="preserve">42</w:t>
       </w:r>
     </w:p>
     <w:p>
@@ -5638,7 +5638,7 @@
           <w:sz w:val="22"/>
           <w:szCs w:val="22"/>
         </w:rPr>
-        <w:t xml:space="preserve">8</w:t>
+        <w:t xml:space="preserve">7</w:t>
       </w:r>
     </w:p>
     <w:p>
@@ -6434,7 +6434,7 @@
           <w:sz w:val="23"/>
           <w:szCs w:val="23"/>
         </w:rPr>
-        <w:t xml:space="preserve">Tableau 5.7 : Réglages testés et résultats</w:t>
+        <w:t xml:space="preserve">Tableau 5.7 : Hyperparamètres des modèles</w:t>
       </w:r>
       <w:r>
         <w:rPr>
@@ -6471,7 +6471,7 @@
           <w:sz w:val="23"/>
           <w:szCs w:val="23"/>
         </w:rPr>
-        <w:t xml:space="preserve">Tableau 5.8 : Effet du réglage sur la validation N-1 (mai 2025)</w:t>
+        <w:t xml:space="preserve">Tableau 5.8 : Performances des modèles en validation croisée</w:t>
       </w:r>
       <w:r>
         <w:rPr>
@@ -6508,7 +6508,7 @@
           <w:sz w:val="23"/>
           <w:szCs w:val="23"/>
         </w:rPr>
-        <w:t xml:space="preserve">Tableau 5.9 : Performances des modèles (validation croisée et mai 2025)</w:t>
+        <w:t xml:space="preserve">Tableau 5.9 : Bilan des livrables du Sprint 3</w:t>
       </w:r>
       <w:r>
         <w:rPr>
@@ -6526,7 +6526,7 @@
           <w:sz w:val="22"/>
           <w:szCs w:val="22"/>
         </w:rPr>
-        <w:t xml:space="preserve">41</w:t>
+        <w:t xml:space="preserve">43</w:t>
       </w:r>
     </w:p>
     <w:p>
@@ -6545,7 +6545,7 @@
           <w:sz w:val="23"/>
           <w:szCs w:val="23"/>
         </w:rPr>
-        <w:t xml:space="preserve">Tableau 5.10 : Bilan des livrables du Sprint 3</w:t>
+        <w:t xml:space="preserve">Tableau 6.1 : Bilan des livrables du Sprint 4</w:t>
       </w:r>
       <w:r>
         <w:rPr>
@@ -6563,44 +6563,7 @@
           <w:sz w:val="22"/>
           <w:szCs w:val="22"/>
         </w:rPr>
-        <w:t xml:space="preserve">44</w:t>
-      </w:r>
-    </w:p>
-    <w:p>
-      <w:pPr>
-        <w:tabs>
-          <w:tab w:val="right" w:pos="8666" w:leader="dot"/>
-        </w:tabs>
-        <w:spacing w:after="25" w:before="70"/>
-        <w:ind w:left="360"/>
-      </w:pPr>
-      <w:r>
-        <w:rPr>
-          <w:rFonts w:ascii="Times New Roman" w:cs="Times New Roman" w:eastAsia="Times New Roman" w:hAnsi="Times New Roman"/>
-          <w:b w:val="false"/>
-          <w:bCs w:val="false"/>
-          <w:sz w:val="23"/>
-          <w:szCs w:val="23"/>
-        </w:rPr>
-        <w:t xml:space="preserve">Tableau 6.1 : Bilan des livrables du Sprint 4</w:t>
-      </w:r>
-      <w:r>
-        <w:rPr>
-          <w:rFonts w:ascii="Times New Roman" w:cs="Times New Roman" w:eastAsia="Times New Roman" w:hAnsi="Times New Roman"/>
-          <w:sz w:val="23"/>
-          <w:szCs w:val="23"/>
-        </w:rPr>
-        <w:tab/>
-      </w:r>
-      <w:r>
-        <w:rPr>
-          <w:rFonts w:ascii="Times New Roman" w:cs="Times New Roman" w:eastAsia="Times New Roman" w:hAnsi="Times New Roman"/>
-          <w:b w:val="false"/>
-          <w:bCs w:val="false"/>
-          <w:sz w:val="22"/>
-          <w:szCs w:val="22"/>
-        </w:rPr>
-        <w:t xml:space="preserve">51</w:t>
+        <w:t xml:space="preserve">50</w:t>
       </w:r>
     </w:p>
     <w:p>
@@ -7785,6 +7748,116 @@
                 <w:sz w:val="18"/>
                 <w:szCs w:val="18"/>
               </w:rPr>
+              <w:t xml:space="preserve">MAPE</w:t>
+            </w:r>
+          </w:p>
+        </w:tc>
+        <w:tc>
+          <w:tcPr>
+            <w:tcW w:type="dxa" w:w="3600"/>
+            <w:tcBorders>
+              <w:top w:val="single" w:color="AAAAAA" w:sz="1"/>
+              <w:left w:val="single" w:color="AAAAAA" w:sz="1"/>
+              <w:bottom w:val="single" w:color="AAAAAA" w:sz="1"/>
+              <w:right w:val="single" w:color="AAAAAA" w:sz="1"/>
+            </w:tcBorders>
+            <w:shd w:fill="FFFFFF" w:val="clear"/>
+            <w:tcMar>
+              <w:top w:type="dxa" w:w="40"/>
+              <w:left w:type="dxa" w:w="80"/>
+              <w:bottom w:type="dxa" w:w="40"/>
+              <w:right w:type="dxa" w:w="80"/>
+            </w:tcMar>
+          </w:tcPr>
+          <w:p>
+            <w:pPr>
+              <w:spacing w:after="20" w:before="20" w:line="240" w:lineRule="auto"/>
+              <w:jc w:val="center"/>
+            </w:pPr>
+            <w:r>
+              <w:rPr>
+                <w:rFonts w:ascii="Arial" w:cs="Arial" w:eastAsia="Arial" w:hAnsi="Arial"/>
+                <w:b w:val="false"/>
+                <w:bCs w:val="false"/>
+                <w:i w:val="false"/>
+                <w:iCs w:val="false"/>
+                <w:sz w:val="18"/>
+                <w:szCs w:val="18"/>
+              </w:rPr>
+              <w:t xml:space="preserve">Mean Absolute Percentage Error</w:t>
+            </w:r>
+          </w:p>
+        </w:tc>
+        <w:tc>
+          <w:tcPr>
+            <w:tcW w:type="dxa" w:w="3466"/>
+            <w:tcBorders>
+              <w:top w:val="single" w:color="AAAAAA" w:sz="1"/>
+              <w:left w:val="single" w:color="AAAAAA" w:sz="1"/>
+              <w:bottom w:val="single" w:color="AAAAAA" w:sz="1"/>
+              <w:right w:val="single" w:color="AAAAAA" w:sz="1"/>
+            </w:tcBorders>
+            <w:shd w:fill="FFFFFF" w:val="clear"/>
+            <w:tcMar>
+              <w:top w:type="dxa" w:w="40"/>
+              <w:left w:type="dxa" w:w="80"/>
+              <w:bottom w:type="dxa" w:w="40"/>
+              <w:right w:type="dxa" w:w="80"/>
+            </w:tcMar>
+          </w:tcPr>
+          <w:p>
+            <w:pPr>
+              <w:spacing w:after="20" w:before="20" w:line="240" w:lineRule="auto"/>
+              <w:jc w:val="left"/>
+            </w:pPr>
+            <w:r>
+              <w:rPr>
+                <w:rFonts w:ascii="Arial" w:cs="Arial" w:eastAsia="Arial" w:hAnsi="Arial"/>
+                <w:b w:val="false"/>
+                <w:bCs w:val="false"/>
+                <w:i w:val="false"/>
+                <w:iCs w:val="false"/>
+                <w:sz w:val="18"/>
+                <w:szCs w:val="18"/>
+              </w:rPr>
+              <w:t xml:space="preserve">Erreur moyenne en pourcentage de la production réelle</w:t>
+            </w:r>
+          </w:p>
+        </w:tc>
+      </w:tr>
+      <w:tr>
+        <w:tc>
+          <w:tcPr>
+            <w:tcW w:type="dxa" w:w="1600"/>
+            <w:tcBorders>
+              <w:top w:val="single" w:color="AAAAAA" w:sz="1"/>
+              <w:left w:val="single" w:color="AAAAAA" w:sz="1"/>
+              <w:bottom w:val="single" w:color="AAAAAA" w:sz="1"/>
+              <w:right w:val="single" w:color="AAAAAA" w:sz="1"/>
+            </w:tcBorders>
+            <w:shd w:fill="FFFFFF" w:val="clear"/>
+            <w:tcMar>
+              <w:top w:type="dxa" w:w="40"/>
+              <w:left w:type="dxa" w:w="80"/>
+              <w:bottom w:type="dxa" w:w="40"/>
+              <w:right w:type="dxa" w:w="80"/>
+            </w:tcMar>
+          </w:tcPr>
+          <w:p>
+            <w:pPr>
+              <w:spacing w:after="20" w:before="20" w:line="240" w:lineRule="auto"/>
+              <w:jc w:val="left"/>
+            </w:pPr>
+            <w:r>
+              <w:rPr>
+                <w:rFonts w:ascii="Arial" w:cs="Arial" w:eastAsia="Arial" w:hAnsi="Arial"/>
+                <w:b w:val="false"/>
+                <w:bCs w:val="false"/>
+                <w:i w:val="false"/>
+                <w:iCs w:val="false"/>
+                <w:sz w:val="18"/>
+                <w:szCs w:val="18"/>
+              </w:rPr>
               <w:t xml:space="preserve">MES</w:t>
             </w:r>
           </w:p>
@@ -9363,7 +9436,7 @@
           <w:sz w:val="24"/>
           <w:szCs w:val="24"/>
         </w:rPr>
-        <w:t xml:space="preserve">Le chapitre 5 (Sprint 3) expose la démarche de modélisation prédictive des cadences : validation croisée temporelle, réglage des hyperparamètres et sélection automatique du meilleur modèle pour chaque mois.</w:t>
+        <w:t xml:space="preserve">Le chapitre 5 (Sprint 3) expose la démarche de modélisation prédictive des cadences : comparaison de quatre modèles par validation croisée temporelle et choix du modèle le plus précis.</w:t>
       </w:r>
     </w:p>
     <w:p>
@@ -9668,7 +9741,7 @@
           <w:sz w:val="24"/>
           <w:szCs w:val="24"/>
         </w:rPr>
-        <w:t xml:space="preserve">Ce projet a été réalisé au sein de WeData Consult, une société de conseil en systèmes d'information située à Sousse, en Tunisie (Immeuble Safa 3, Sahloul 1). Avec pour devise « The partner of your data », elle est dirigée par deux associés qui cumulent plus de quinze ans d'expérience dans l'intégration de progiciels de gestion intégrée (ERP) en Tunisie et à l'international. WeData Consult accompagne ses clients en matière de conseil, d'intégration, de support et de formation, afin de leur garantir un système d'information performant.</w:t>
+        <w:t xml:space="preserve">Ce projet a été réalisé au sein de WeData Consult, une société de conseil en systèmes d'information située à Sousse, en Tunisie. Avec pour devise « The partner of your data », elle est dirigée par deux associés qui cumulent plus de quinze ans d'expérience dans l'intégration de progiciels de gestion intégrée (ERP) en Tunisie et à l'international. WeData Consult accompagne ses clients en matière de conseil, d'intégration, de support et de formation, afin de leur garantir un système d'information performant.</w:t>
       </w:r>
     </w:p>
     <w:p>
@@ -9899,7 +9972,7 @@
           <w:sz w:val="24"/>
           <w:szCs w:val="24"/>
         </w:rPr>
-        <w:t xml:space="preserve">Nexora est une solution logicielle d'aide à la décision conçue pour faciliter le suivi des ateliers d'injection plastique et la gestion proactive des approvisionnements de stock. Elle s'appuie sur les données centralisées dans le Data Warehouse pour proposer des indicateurs de production calculés directement sur le Data Warehouse (actualisés toutes les 10 minutes), des prévisions de cadence de production par apprentissage automatique et des recommandations quantifiées de réapprovisionnement.</w:t>
+        <w:t xml:space="preserve">Nexora est une solution logicielle d'aide à la décision conçue pour faciliter le suivi des ateliers d'injection plastique et la gestion proactive des approvisionnements de stock. Elle s'appuie sur les données centralisées dans le Data Warehouse pour proposer des indicateurs de production calculés directement sur le Data Warehouse, des prévisions de cadence de production par apprentissage automatique et des recommandations quantifiées de réapprovisionnement.</w:t>
       </w:r>
     </w:p>
     <w:p>
@@ -10192,7 +10265,7 @@
           <w:sz w:val="24"/>
           <w:szCs w:val="24"/>
         </w:rPr>
-        <w:t xml:space="preserve">Prévision des volumes de fabrication : estimation de la production journalière pour le mois choisi par le meilleur de quatre modèles, sélectionné automatiquement, afin de guider l'ordonnancement des équipes et des approvisionnements matières.</w:t>
+        <w:t xml:space="preserve">Prévision des volumes de fabrication : estimation de la production journalière pour le mois choisi par un modèle Random Forest, retenu après comparaison de quatre modèles, afin de guider l'ordonnancement des équipes et des approvisionnements matières.</w:t>
       </w:r>
     </w:p>
     <w:p>
@@ -13109,7 +13182,7 @@
           <w:sz w:val="24"/>
           <w:szCs w:val="24"/>
         </w:rPr>
-        <w:t xml:space="preserve">5. Réglage des hyperparamètres : recherche sur grille par validation croisée (6 plis de 30 jours) ou par AIC, contrôlée sur l'année précédente.</w:t>
+        <w:t xml:space="preserve">5. Réglage des hyperparamètres : recherche sur grille par validation croisée ou par AIC (option).</w:t>
       </w:r>
     </w:p>
     <w:p>
@@ -13132,7 +13205,7 @@
           <w:sz w:val="24"/>
           <w:szCs w:val="24"/>
         </w:rPr>
-        <w:t xml:space="preserve">6. Sélection du modèle : le modèle retenu est celui qui obtient la plus faible erreur moyenne (MAE) sur le même mois de l'année précédente (mai 2025 pour une prévision de mai 2026).</w:t>
+        <w:t xml:space="preserve">6. Sélection du modèle : le modèle retenu est celui qui obtient la plus faible erreur moyenne (MAE) en validation croisée, soit Random Forest.</w:t>
       </w:r>
     </w:p>
     <w:p>
@@ -13155,7 +13228,7 @@
           <w:sz w:val="24"/>
           <w:szCs w:val="24"/>
         </w:rPr>
-        <w:t xml:space="preserve">7. Prévision et mesure des performances : prévision du mois choisi et calcul des erreurs (MAE, RMSE, R²) en unités produites par jour.</w:t>
+        <w:t xml:space="preserve">7. Prévision et mesure des performances : prévision du mois choisi et calcul des erreurs (MAE, RMSE, R², MAPE, écart de volume) en unités produites par jour.</w:t>
       </w:r>
     </w:p>
     <w:p>
@@ -19473,7 +19546,7 @@
                 <w:sz w:val="18"/>
                 <w:szCs w:val="18"/>
               </w:rPr>
-              <w:t xml:space="preserve">Validation croisée temporelle, réglage des hyperparamètres, comparaison des quatre modèles et sélection automatique du meilleur modèle.</w:t>
+              <w:t xml:space="preserve">Validation croisée temporelle, réglage des hyperparamètres, comparaison des quatre modèles et choix du modèle le plus précis.</w:t>
             </w:r>
           </w:p>
         </w:tc>
@@ -21689,7 +21762,7 @@
           <w:sz w:val="24"/>
           <w:szCs w:val="24"/>
         </w:rPr>
-        <w:t xml:space="preserve">3. Couche Métier &amp; IA (Business &amp; AI Layer) : regroupe les modèles de prévision (Régression Linéaire, ARIMA, Random Forest et Prophet [12], le meilleur étant sélectionné automatiquement pour chaque période) ainsi que le moteur logistique de calcul des couvertures de stock. Sur la page Prévisions, les résultats sont calculés à la demande puis mis en cache ; la page Benchmark relance à chaque ouverture l'entraînement complet des quatre modèles et affiche ses étapes en direct. Elle s'appuie sur un service Python FastAPI [21] pour les prévisions et sur un serveur Spring Boot [17] pour les règles métier et les droits d'accès.</w:t>
+        <w:t xml:space="preserve">3. Couche Métier &amp; IA (Business &amp; AI Layer) : regroupe les modèles de prévision (Régression Linéaire, ARIMA, Random Forest et Prophet [12], Random Forest étant retenu après comparaison) ainsi que le moteur logistique de calcul des couvertures de stock. Sur la page Prévisions, les résultats sont calculés à la demande puis mis en cache ; la page Benchmark relance à chaque ouverture l'entraînement complet des quatre modèles et affiche ses étapes en direct. Elle s'appuie sur un service Python FastAPI [21] pour les prévisions et sur un serveur Spring Boot [17] pour les règles métier et les droits d'accès.</w:t>
       </w:r>
     </w:p>
     <w:p>
@@ -24689,7 +24762,7 @@
           <w:sz w:val="24"/>
           <w:szCs w:val="24"/>
         </w:rPr>
-        <w:t xml:space="preserve">Les données exploitées dans ce projet proviennent du système d'information industriel de l'équipementier partenaire, couvrant les usines de Kondar et Sousse en Tunisie ainsi que le site de Brno en République Tchèque. La table de production FACT_CLE couvre la période du 2 janvier 2019 au 29 mars 2026 ; la modélisation exploite l'historique récent, du 1er janvier 2024 au 26 mars 2026, soit 816 jours consécutifs (les derniers jours, dont la quantité TRS n'est pas encore consolidée, sont exclus automatiquement).</w:t>
+        <w:t xml:space="preserve">Les données exploitées dans ce projet proviennent du système d'information industriel de l'équipementier partenaire, couvrant les usines de Kondar et Sousse en Tunisie ainsi que le site de Brno en République Tchèque. La table de production FACT_CLE couvre la période du 2 janvier 2019 au 29 mars 2026 ; la modélisation exploite l'historique du 2 janvier 2020 au 26 mars 2026, soit 2 276 jours consécutifs (l'année 2019, incomplète, est écartée) (les derniers jours, dont la quantité TRS n'est pas encore consolidée, sont exclus automatiquement).</w:t>
       </w:r>
     </w:p>
     <w:p>
@@ -24919,7 +24992,7 @@
                 <w:sz w:val="18"/>
                 <w:szCs w:val="18"/>
               </w:rPr>
-              <w:t xml:space="preserve">01/01/2024 – 26/03/2026</w:t>
+              <w:t xml:space="preserve">02/01/2020 – 26/03/2026</w:t>
             </w:r>
           </w:p>
         </w:tc>
@@ -24955,7 +25028,7 @@
                 <w:sz w:val="18"/>
                 <w:szCs w:val="18"/>
               </w:rPr>
-              <w:t xml:space="preserve">816 jours consécutifs (FACT_CLE disponible depuis le 02/01/2019).</w:t>
+              <w:t xml:space="preserve">2 276 jours consécutifs (l'année 2019, incomplète, est écartée).</w:t>
             </w:r>
           </w:p>
         </w:tc>
@@ -36788,7 +36861,7 @@
           <w:sz w:val="24"/>
           <w:szCs w:val="24"/>
         </w:rPr>
-        <w:t xml:space="preserve">La validation croisée temporelle montre que les quatre modèles obtiennent des erreurs proches sur l'historique récent (erreur moyenne de 67 927 à 75 122 unités par jour sur 12 plis de 30 jours), ce qui reflète la forte variabilité journalière de la production. Le choix du modèle n'est donc pas figé : pour chaque mois à prévoir, la plateforme retient automatiquement le modèle le plus précis sur le même mois de l'année précédente. Pour mai 2026, il s'agit de Random Forest.</w:t>
+        <w:t xml:space="preserve">La validation croisée temporelle, menée sur six ans d'historique, montre que Random Forest et Prophet sont les plus précis et très proches ; Random Forest, qui obtient la plus faible erreur moyenne, est le modèle utilisé par l'application.</w:t>
       </w:r>
     </w:p>
     <w:p>
@@ -36875,7 +36948,7 @@
           <w:sz w:val="24"/>
           <w:szCs w:val="24"/>
         </w:rPr>
-        <w:t xml:space="preserve">1. Extraction des données d'atelier : lecture de l'historique des déclarations de fabrication depuis la table FACT_CLE du Data Warehouse (816 jours, du 01/01/2024 au 26/03/2026).</w:t>
+        <w:t xml:space="preserve">1. Extraction des données d'atelier : lecture de l'historique des déclarations de fabrication depuis la table FACT_CLE du Data Warehouse (2 276 jours, du 02/01/2020 au 26/03/2026).</w:t>
       </w:r>
     </w:p>
     <w:p>
@@ -36996,7 +37069,7 @@
           <w:sz w:val="24"/>
           <w:szCs w:val="24"/>
         </w:rPr>
-        <w:t xml:space="preserve">4. Évaluation et sélection : validation croisée temporelle (MAE, RMSE, R²), réglage des hyperparamètres et sélection du meilleur modèle sur le même mois de l'année précédente.</w:t>
+        <w:t xml:space="preserve">4. Évaluation et sélection : validation croisée temporelle (MAE, RMSE, R², MAPE, écart de volume) et choix du modèle le plus précis.</w:t>
       </w:r>
     </w:p>
     <w:p>
@@ -37834,7 +37907,7 @@
           <w:sz w:val="24"/>
           <w:szCs w:val="24"/>
         </w:rPr>
-        <w:t xml:space="preserve">Une validation croisée classique (k-fold aléatoire) entraînerait les modèles sur le futur pour prédire le passé. Nous utilisons donc une validation croisée à origine glissante : à chaque pli, le modèle est entraîné uniquement sur les jours antérieurs à la date de coupure, puis évalué sur les 30 jours suivants (tableau 5.2) :</w:t>
+        <w:t xml:space="preserve">Une validation croisée classique (k-fold aléatoire) entraînerait les modèles sur le futur pour prédire le passé. Nous utilisons donc une validation croisée à origine glissante : à chaque pli, le modèle est entraîné uniquement sur les jours antérieurs à la date de coupure, puis évalué sur les 31 jours suivants (tableau 5.2) :</w:t>
       </w:r>
     </w:p>
     <w:p>
@@ -38082,7 +38155,7 @@
                 <w:sz w:val="18"/>
                 <w:szCs w:val="18"/>
               </w:rPr>
-              <w:t xml:space="preserve">12 coupures successives ; tests du 01/04/2025 au 26/03/2026</w:t>
+              <w:t xml:space="preserve">12 coupures successives ; tests du 20/03/2025 au 26/03/2026</w:t>
             </w:r>
           </w:p>
         </w:tc>
@@ -38118,7 +38191,7 @@
                 <w:sz w:val="18"/>
                 <w:szCs w:val="18"/>
               </w:rPr>
-              <w:t xml:space="preserve">12 × 30 jours</w:t>
+              <w:t xml:space="preserve">12 × 31 jours</w:t>
             </w:r>
           </w:p>
         </w:tc>
@@ -38154,7 +38227,7 @@
                 <w:sz w:val="18"/>
                 <w:szCs w:val="18"/>
               </w:rPr>
-              <w:t xml:space="preserve">Erreur moyenne des modèles (MAE, RMSE, R²).</w:t>
+              <w:t xml:space="preserve">Erreurs des modèles (MAE, RMSE, R², MAPE, écart de volume).</w:t>
             </w:r>
           </w:p>
         </w:tc>
@@ -38192,7 +38265,7 @@
                 <w:sz w:val="18"/>
                 <w:szCs w:val="18"/>
               </w:rPr>
-              <w:t xml:space="preserve">Réglage des hyperparamètres</w:t>
+              <w:t xml:space="preserve">Réglage des hyperparamètres (option)</w:t>
             </w:r>
           </w:p>
         </w:tc>
@@ -38228,7 +38301,7 @@
                 <w:sz w:val="18"/>
                 <w:szCs w:val="18"/>
               </w:rPr>
-              <w:t xml:space="preserve">données antérieures au 01/05/2025, 6 plis</w:t>
+              <w:t xml:space="preserve">historique antérieur à la période de test, 6 plis</w:t>
             </w:r>
           </w:p>
         </w:tc>
@@ -38264,7 +38337,7 @@
                 <w:sz w:val="18"/>
                 <w:szCs w:val="18"/>
               </w:rPr>
-              <w:t xml:space="preserve">6 × 30 jours</w:t>
+              <w:t xml:space="preserve">6 × 31 jours</w:t>
             </w:r>
           </w:p>
         </w:tc>
@@ -38300,153 +38373,7 @@
                 <w:sz w:val="18"/>
                 <w:szCs w:val="18"/>
               </w:rPr>
-              <w:t xml:space="preserve">Choix des hyperparamètres de chaque modèle (option).</w:t>
-            </w:r>
-          </w:p>
-        </w:tc>
-      </w:tr>
-      <w:tr>
-        <w:tc>
-          <w:tcPr>
-            <w:tcW w:type="dxa" w:w="2400"/>
-            <w:tcBorders>
-              <w:top w:val="single" w:color="AAAAAA" w:sz="1"/>
-              <w:left w:val="single" w:color="AAAAAA" w:sz="1"/>
-              <w:bottom w:val="single" w:color="AAAAAA" w:sz="1"/>
-              <w:right w:val="single" w:color="AAAAAA" w:sz="1"/>
-            </w:tcBorders>
-            <w:shd w:fill="F9FBFD" w:val="clear"/>
-            <w:tcMar>
-              <w:top w:type="dxa" w:w="40"/>
-              <w:left w:type="dxa" w:w="80"/>
-              <w:bottom w:type="dxa" w:w="40"/>
-              <w:right w:type="dxa" w:w="80"/>
-            </w:tcMar>
-          </w:tcPr>
-          <w:p>
-            <w:pPr>
-              <w:spacing w:after="20" w:before="20" w:line="240" w:lineRule="auto"/>
-              <w:jc w:val="left"/>
-            </w:pPr>
-            <w:r>
-              <w:rPr>
-                <w:rFonts w:ascii="Arial" w:cs="Arial" w:eastAsia="Arial" w:hAnsi="Arial"/>
-                <w:b w:val="false"/>
-                <w:bCs w:val="false"/>
-                <w:i w:val="false"/>
-                <w:iCs w:val="false"/>
-                <w:sz w:val="18"/>
-                <w:szCs w:val="18"/>
-              </w:rPr>
-              <w:t xml:space="preserve">Validation N-1 (sélection)</w:t>
-            </w:r>
-          </w:p>
-        </w:tc>
-        <w:tc>
-          <w:tcPr>
-            <w:tcW w:type="dxa" w:w="2400"/>
-            <w:tcBorders>
-              <w:top w:val="single" w:color="AAAAAA" w:sz="1"/>
-              <w:left w:val="single" w:color="AAAAAA" w:sz="1"/>
-              <w:bottom w:val="single" w:color="AAAAAA" w:sz="1"/>
-              <w:right w:val="single" w:color="AAAAAA" w:sz="1"/>
-            </w:tcBorders>
-            <w:shd w:fill="F9FBFD" w:val="clear"/>
-            <w:tcMar>
-              <w:top w:type="dxa" w:w="40"/>
-              <w:left w:type="dxa" w:w="80"/>
-              <w:bottom w:type="dxa" w:w="40"/>
-              <w:right w:type="dxa" w:w="80"/>
-            </w:tcMar>
-          </w:tcPr>
-          <w:p>
-            <w:pPr>
-              <w:spacing w:after="20" w:before="20" w:line="240" w:lineRule="auto"/>
-              <w:jc w:val="center"/>
-            </w:pPr>
-            <w:r>
-              <w:rPr>
-                <w:rFonts w:ascii="Arial" w:cs="Arial" w:eastAsia="Arial" w:hAnsi="Arial"/>
-                <w:b w:val="false"/>
-                <w:bCs w:val="false"/>
-                <w:i w:val="false"/>
-                <w:iCs w:val="false"/>
-                <w:sz w:val="18"/>
-                <w:szCs w:val="18"/>
-              </w:rPr>
-              <w:t xml:space="preserve">entraînement jusqu'au 30/04/2025, test du 01/05 au 31/05/2025</w:t>
-            </w:r>
-          </w:p>
-        </w:tc>
-        <w:tc>
-          <w:tcPr>
-            <w:tcW w:type="dxa" w:w="1600"/>
-            <w:tcBorders>
-              <w:top w:val="single" w:color="AAAAAA" w:sz="1"/>
-              <w:left w:val="single" w:color="AAAAAA" w:sz="1"/>
-              <w:bottom w:val="single" w:color="AAAAAA" w:sz="1"/>
-              <w:right w:val="single" w:color="AAAAAA" w:sz="1"/>
-            </w:tcBorders>
-            <w:shd w:fill="F9FBFD" w:val="clear"/>
-            <w:tcMar>
-              <w:top w:type="dxa" w:w="40"/>
-              <w:left w:type="dxa" w:w="80"/>
-              <w:bottom w:type="dxa" w:w="40"/>
-              <w:right w:type="dxa" w:w="80"/>
-            </w:tcMar>
-          </w:tcPr>
-          <w:p>
-            <w:pPr>
-              <w:spacing w:after="20" w:before="20" w:line="240" w:lineRule="auto"/>
-              <w:jc w:val="center"/>
-            </w:pPr>
-            <w:r>
-              <w:rPr>
-                <w:rFonts w:ascii="Arial" w:cs="Arial" w:eastAsia="Arial" w:hAnsi="Arial"/>
-                <w:b w:val="false"/>
-                <w:bCs w:val="false"/>
-                <w:i w:val="false"/>
-                <w:iCs w:val="false"/>
-                <w:sz w:val="18"/>
-                <w:szCs w:val="18"/>
-              </w:rPr>
-              <w:t xml:space="preserve">31 jours</w:t>
-            </w:r>
-          </w:p>
-        </w:tc>
-        <w:tc>
-          <w:tcPr>
-            <w:tcW w:type="dxa" w:w="2266"/>
-            <w:tcBorders>
-              <w:top w:val="single" w:color="AAAAAA" w:sz="1"/>
-              <w:left w:val="single" w:color="AAAAAA" w:sz="1"/>
-              <w:bottom w:val="single" w:color="AAAAAA" w:sz="1"/>
-              <w:right w:val="single" w:color="AAAAAA" w:sz="1"/>
-            </w:tcBorders>
-            <w:shd w:fill="F9FBFD" w:val="clear"/>
-            <w:tcMar>
-              <w:top w:type="dxa" w:w="40"/>
-              <w:left w:type="dxa" w:w="80"/>
-              <w:bottom w:type="dxa" w:w="40"/>
-              <w:right w:type="dxa" w:w="80"/>
-            </w:tcMar>
-          </w:tcPr>
-          <w:p>
-            <w:pPr>
-              <w:spacing w:after="20" w:before="20" w:line="240" w:lineRule="auto"/>
-              <w:jc w:val="left"/>
-            </w:pPr>
-            <w:r>
-              <w:rPr>
-                <w:rFonts w:ascii="Arial" w:cs="Arial" w:eastAsia="Arial" w:hAnsi="Arial"/>
-                <w:b w:val="false"/>
-                <w:bCs w:val="false"/>
-                <w:i w:val="false"/>
-                <w:iCs w:val="false"/>
-                <w:sz w:val="18"/>
-                <w:szCs w:val="18"/>
-              </w:rPr>
-              <w:t xml:space="preserve">Choix du meilleur modèle pour la prévision de mai 2026.</w:t>
+              <w:t xml:space="preserve">Choix des hyperparamètres de chaque modèle.</w:t>
             </w:r>
           </w:p>
         </w:tc>
@@ -38530,7 +38457,7 @@
           <w:sz w:val="24"/>
           <w:szCs w:val="24"/>
         </w:rPr>
-        <w:t xml:space="preserve">La qualité des prévisions est mesurée par trois indicateurs simples [4] :</w:t>
+        <w:t xml:space="preserve">La qualité des prévisions est mesurée par cinq indicateurs simples [4] :</w:t>
       </w:r>
     </w:p>
     <w:p>
@@ -38760,6 +38687,74 @@
           <w:szCs w:val="24"/>
         </w:rPr>
         <w:t xml:space="preserve"/>
+      </w:r>
+    </w:p>
+    <w:p>
+      <w:pPr>
+        <w:pStyle w:val="ListParagraph"/>
+        <w:numPr>
+          <w:ilvl w:val="0"/>
+          <w:numId w:val="2"/>
+        </w:numPr>
+        <w:spacing w:after="50" w:before="50" w:line="340" w:lineRule="auto"/>
+      </w:pPr>
+      <w:r>
+        <w:rPr>
+          <w:rFonts w:ascii="Times New Roman" w:cs="Times New Roman" w:eastAsia="Times New Roman" w:hAnsi="Times New Roman"/>
+          <w:b w:val="false"/>
+          <w:bCs w:val="false"/>
+          <w:i w:val="false"/>
+          <w:iCs w:val="false"/>
+          <w:color w:val="1A1A1A"/>
+          <w:sz w:val="24"/>
+          <w:szCs w:val="24"/>
+        </w:rPr>
+        <w:t xml:space="preserve">MAPE (Mean Absolute Percentage Error) : erreur moyenne exprimée en pourcentage de la production réelle, calculée sur les jours de production :</w:t>
+        <w:br/>
+        <w:t xml:space="preserve">MAPE = (100 / n) × Σ |y_i − ŷ_i| / y_i</w:t>
+      </w:r>
+    </w:p>
+    <w:p>
+      <w:pPr>
+        <w:pStyle w:val="ListParagraph"/>
+        <w:numPr>
+          <w:ilvl w:val="0"/>
+          <w:numId w:val="2"/>
+        </w:numPr>
+        <w:spacing w:after="50" w:before="50" w:line="340" w:lineRule="auto"/>
+      </w:pPr>
+      <w:r>
+        <w:rPr>
+          <w:rFonts w:ascii="Times New Roman" w:cs="Times New Roman" w:eastAsia="Times New Roman" w:hAnsi="Times New Roman"/>
+          <w:b w:val="false"/>
+          <w:bCs w:val="false"/>
+          <w:i w:val="false"/>
+          <w:iCs w:val="false"/>
+          <w:color w:val="1A1A1A"/>
+          <w:sz w:val="24"/>
+          <w:szCs w:val="24"/>
+        </w:rPr>
+        <w:t xml:space="preserve">Écart de volume mensuel : écart entre le volume total prévu et le volume réel sur chaque période de test de 31 jours ; c'est l'indicateur le plus proche du besoin de planification :</w:t>
+        <w:br/>
+        <w:t xml:space="preserve">Écart = |Σ ŷ_i − Σ y_i| / Σ y_i × 100</w:t>
+      </w:r>
+    </w:p>
+    <w:p>
+      <w:pPr>
+        <w:spacing w:after="50" w:before="50" w:line="340" w:lineRule="auto"/>
+      </w:pPr>
+      <w:r>
+        <w:rPr>
+          <w:rFonts w:ascii="Times New Roman" w:cs="Times New Roman" w:eastAsia="Times New Roman" w:hAnsi="Times New Roman"/>
+          <w:b w:val="false"/>
+          <w:bCs w:val="false"/>
+          <w:i w:val="false"/>
+          <w:iCs w:val="false"/>
+          <w:color w:val="1A1A1A"/>
+          <w:sz w:val="24"/>
+          <w:szCs w:val="24"/>
+        </w:rPr>
+        <w:t xml:space="preserve">Pour une évaluation juste, la règle de plafonnement des journées aberrantes utilisée à l'apprentissage est aussi appliquée aux données de test, et la MAPE ne porte que sur les jours de production (au moins 10 % d'une journée habituelle), une journée quasi à l'arrêt n'ayant pas d'erreur relative significative.</w:t>
       </w:r>
     </w:p>
     <w:p>
@@ -40882,7 +40877,7 @@
           <w:sz w:val="24"/>
           <w:szCs w:val="24"/>
         </w:rPr>
-        <w:t xml:space="preserve">Chaque modèle possède quelques réglages, appelés hyperparamètres (par exemple le nombre d'arbres pour Random Forest). Pour chacun, nous avons testé plusieurs valeurs et retenu celles qui donnent la plus petite erreur en validation croisée ; pour ARIMA, le choix se fait avec le critère AIC. Ce test n'utilise que les données antérieures à mai 2025, afin de garder la période de validation N-1 intacte :</w:t>
+        <w:t xml:space="preserve">Chaque modèle possède quelques réglages, appelés hyperparamètres (par exemple le nombre d'arbres pour Random Forest). L'application permet de les régler par recherche sur grille (critère AIC pour ARIMA) ; ce réglage reste optionnel et les résultats présentés utilisent les valeurs par défaut du tableau 5.7 :</w:t>
       </w:r>
     </w:p>
     <w:tbl>
@@ -40899,11 +40894,9 @@
         </w:tblBorders>
       </w:tblPr>
       <w:tblGrid>
-        <w:gridCol w:w="2400"/>
-        <w:gridCol w:w="1800"/>
-        <w:gridCol w:w="1600"/>
-        <w:gridCol w:w="1400"/>
-        <w:gridCol w:w="1466"/>
+        <w:gridCol w:w="3585"/>
+        <w:gridCol w:w="2689"/>
+        <w:gridCol w:w="2390"/>
       </w:tblGrid>
       <w:tr>
         <w:trPr>
@@ -40911,7 +40904,7 @@
         </w:trPr>
         <w:tc>
           <w:tcPr>
-            <w:tcW w:type="dxa" w:w="2400"/>
+            <w:tcW w:type="dxa" w:w="3585"/>
             <w:tcBorders>
               <w:top w:val="single" w:color="AAAAAA" w:sz="1"/>
               <w:left w:val="single" w:color="AAAAAA" w:sz="1"/>
@@ -40947,7 +40940,7 @@
         </w:tc>
         <w:tc>
           <w:tcPr>
-            <w:tcW w:type="dxa" w:w="1800"/>
+            <w:tcW w:type="dxa" w:w="2689"/>
             <w:tcBorders>
               <w:top w:val="single" w:color="AAAAAA" w:sz="1"/>
               <w:left w:val="single" w:color="AAAAAA" w:sz="1"/>
@@ -40983,7 +40976,7 @@
         </w:tc>
         <w:tc>
           <w:tcPr>
-            <w:tcW w:type="dxa" w:w="1600"/>
+            <w:tcW w:type="dxa" w:w="2390"/>
             <w:tcBorders>
               <w:top w:val="single" w:color="AAAAAA" w:sz="1"/>
               <w:left w:val="single" w:color="AAAAAA" w:sz="1"/>
@@ -41017,83 +41010,11 @@
             </w:r>
           </w:p>
         </w:tc>
-        <w:tc>
-          <w:tcPr>
-            <w:tcW w:type="dxa" w:w="1400"/>
-            <w:tcBorders>
-              <w:top w:val="single" w:color="AAAAAA" w:sz="1"/>
-              <w:left w:val="single" w:color="AAAAAA" w:sz="1"/>
-              <w:bottom w:val="single" w:color="AAAAAA" w:sz="1"/>
-              <w:right w:val="single" w:color="AAAAAA" w:sz="1"/>
-            </w:tcBorders>
-            <w:shd w:fill="333333" w:val="clear"/>
-            <w:tcMar>
-              <w:top w:type="dxa" w:w="50"/>
-              <w:left w:type="dxa" w:w="80"/>
-              <w:bottom w:type="dxa" w:w="50"/>
-              <w:right w:type="dxa" w:w="80"/>
-            </w:tcMar>
-            <w:vAlign w:val="center"/>
-          </w:tcPr>
-          <w:p>
-            <w:pPr>
-              <w:spacing w:after="20" w:before="20"/>
-              <w:jc w:val="center"/>
-            </w:pPr>
-            <w:r>
-              <w:rPr>
-                <w:rFonts w:ascii="Arial" w:cs="Arial" w:eastAsia="Arial" w:hAnsi="Arial"/>
-                <w:b/>
-                <w:bCs/>
-                <w:color w:val="FFFFFF"/>
-                <w:sz w:val="19"/>
-                <w:szCs w:val="19"/>
-              </w:rPr>
-              <w:t xml:space="preserve">Valeur retenue</w:t>
-            </w:r>
-          </w:p>
-        </w:tc>
-        <w:tc>
-          <w:tcPr>
-            <w:tcW w:type="dxa" w:w="1466"/>
-            <w:tcBorders>
-              <w:top w:val="single" w:color="AAAAAA" w:sz="1"/>
-              <w:left w:val="single" w:color="AAAAAA" w:sz="1"/>
-              <w:bottom w:val="single" w:color="AAAAAA" w:sz="1"/>
-              <w:right w:val="single" w:color="AAAAAA" w:sz="1"/>
-            </w:tcBorders>
-            <w:shd w:fill="333333" w:val="clear"/>
-            <w:tcMar>
-              <w:top w:type="dxa" w:w="50"/>
-              <w:left w:type="dxa" w:w="80"/>
-              <w:bottom w:type="dxa" w:w="50"/>
-              <w:right w:type="dxa" w:w="80"/>
-            </w:tcMar>
-            <w:vAlign w:val="center"/>
-          </w:tcPr>
-          <w:p>
-            <w:pPr>
-              <w:spacing w:after="20" w:before="20"/>
-              <w:jc w:val="center"/>
-            </w:pPr>
-            <w:r>
-              <w:rPr>
-                <w:rFonts w:ascii="Arial" w:cs="Arial" w:eastAsia="Arial" w:hAnsi="Arial"/>
-                <w:b/>
-                <w:bCs/>
-                <w:color w:val="FFFFFF"/>
-                <w:sz w:val="19"/>
-                <w:szCs w:val="19"/>
-              </w:rPr>
-              <w:t xml:space="preserve">Erreur en validation croisée (unités/j)</w:t>
-            </w:r>
-          </w:p>
-        </w:tc>
       </w:tr>
       <w:tr>
         <w:tc>
           <w:tcPr>
-            <w:tcW w:type="dxa" w:w="2400"/>
+            <w:tcW w:type="dxa" w:w="3585"/>
             <w:tcBorders>
               <w:top w:val="single" w:color="AAAAAA" w:sz="1"/>
               <w:left w:val="single" w:color="AAAAAA" w:sz="1"/>
@@ -41129,7 +41050,7 @@
         </w:tc>
         <w:tc>
           <w:tcPr>
-            <w:tcW w:type="dxa" w:w="1800"/>
+            <w:tcW w:type="dxa" w:w="2689"/>
             <w:tcBorders>
               <w:top w:val="single" w:color="AAAAAA" w:sz="1"/>
               <w:left w:val="single" w:color="AAAAAA" w:sz="1"/>
@@ -41165,7 +41086,7 @@
         </w:tc>
         <w:tc>
           <w:tcPr>
-            <w:tcW w:type="dxa" w:w="1600"/>
+            <w:tcW w:type="dxa" w:w="2390"/>
             <w:tcBorders>
               <w:top w:val="single" w:color="AAAAAA" w:sz="1"/>
               <w:left w:val="single" w:color="AAAAAA" w:sz="1"/>
@@ -41196,78 +41117,6 @@
                 <w:szCs w:val="18"/>
               </w:rPr>
               <w:t xml:space="preserve">200 arbres, profondeur 12</w:t>
-            </w:r>
-          </w:p>
-        </w:tc>
-        <w:tc>
-          <w:tcPr>
-            <w:tcW w:type="dxa" w:w="1400"/>
-            <w:tcBorders>
-              <w:top w:val="single" w:color="AAAAAA" w:sz="1"/>
-              <w:left w:val="single" w:color="AAAAAA" w:sz="1"/>
-              <w:bottom w:val="single" w:color="AAAAAA" w:sz="1"/>
-              <w:right w:val="single" w:color="AAAAAA" w:sz="1"/>
-            </w:tcBorders>
-            <w:shd w:fill="F9FBFD" w:val="clear"/>
-            <w:tcMar>
-              <w:top w:type="dxa" w:w="40"/>
-              <w:left w:type="dxa" w:w="80"/>
-              <w:bottom w:type="dxa" w:w="40"/>
-              <w:right w:type="dxa" w:w="80"/>
-            </w:tcMar>
-          </w:tcPr>
-          <w:p>
-            <w:pPr>
-              <w:spacing w:after="20" w:before="20" w:line="240" w:lineRule="auto"/>
-              <w:jc w:val="center"/>
-            </w:pPr>
-            <w:r>
-              <w:rPr>
-                <w:rFonts w:ascii="Arial" w:cs="Arial" w:eastAsia="Arial" w:hAnsi="Arial"/>
-                <w:b w:val="false"/>
-                <w:bCs w:val="false"/>
-                <w:i w:val="false"/>
-                <w:iCs w:val="false"/>
-                <w:sz w:val="18"/>
-                <w:szCs w:val="18"/>
-              </w:rPr>
-              <w:t xml:space="preserve">200 arbres, profondeur 6</w:t>
-            </w:r>
-          </w:p>
-        </w:tc>
-        <w:tc>
-          <w:tcPr>
-            <w:tcW w:type="dxa" w:w="1466"/>
-            <w:tcBorders>
-              <w:top w:val="single" w:color="AAAAAA" w:sz="1"/>
-              <w:left w:val="single" w:color="AAAAAA" w:sz="1"/>
-              <w:bottom w:val="single" w:color="AAAAAA" w:sz="1"/>
-              <w:right w:val="single" w:color="AAAAAA" w:sz="1"/>
-            </w:tcBorders>
-            <w:shd w:fill="F9FBFD" w:val="clear"/>
-            <w:tcMar>
-              <w:top w:type="dxa" w:w="40"/>
-              <w:left w:type="dxa" w:w="80"/>
-              <w:bottom w:type="dxa" w:w="40"/>
-              <w:right w:type="dxa" w:w="80"/>
-            </w:tcMar>
-          </w:tcPr>
-          <w:p>
-            <w:pPr>
-              <w:spacing w:after="20" w:before="20" w:line="240" w:lineRule="auto"/>
-              <w:jc w:val="center"/>
-            </w:pPr>
-            <w:r>
-              <w:rPr>
-                <w:rFonts w:ascii="Arial" w:cs="Arial" w:eastAsia="Arial" w:hAnsi="Arial"/>
-                <w:b w:val="false"/>
-                <w:bCs w:val="false"/>
-                <w:i w:val="false"/>
-                <w:iCs w:val="false"/>
-                <w:sz w:val="18"/>
-                <w:szCs w:val="18"/>
-              </w:rPr>
-              <w:t xml:space="preserve">48 891 → 48 027</w:t>
             </w:r>
           </w:p>
         </w:tc>
@@ -41275,7 +41124,7 @@
       <w:tr>
         <w:tc>
           <w:tcPr>
-            <w:tcW w:type="dxa" w:w="2400"/>
+            <w:tcW w:type="dxa" w:w="3585"/>
             <w:tcBorders>
               <w:top w:val="single" w:color="AAAAAA" w:sz="1"/>
               <w:left w:val="single" w:color="AAAAAA" w:sz="1"/>
@@ -41311,7 +41160,7 @@
         </w:tc>
         <w:tc>
           <w:tcPr>
-            <w:tcW w:type="dxa" w:w="1800"/>
+            <w:tcW w:type="dxa" w:w="2689"/>
             <w:tcBorders>
               <w:top w:val="single" w:color="AAAAAA" w:sz="1"/>
               <w:left w:val="single" w:color="AAAAAA" w:sz="1"/>
@@ -41347,7 +41196,7 @@
         </w:tc>
         <w:tc>
           <w:tcPr>
-            <w:tcW w:type="dxa" w:w="1600"/>
+            <w:tcW w:type="dxa" w:w="2390"/>
             <w:tcBorders>
               <w:top w:val="single" w:color="AAAAAA" w:sz="1"/>
               <w:left w:val="single" w:color="AAAAAA" w:sz="1"/>
@@ -41378,78 +41227,6 @@
                 <w:szCs w:val="18"/>
               </w:rPr>
               <w:t xml:space="preserve">Souplesse 0,05</w:t>
-            </w:r>
-          </w:p>
-        </w:tc>
-        <w:tc>
-          <w:tcPr>
-            <w:tcW w:type="dxa" w:w="1400"/>
-            <w:tcBorders>
-              <w:top w:val="single" w:color="AAAAAA" w:sz="1"/>
-              <w:left w:val="single" w:color="AAAAAA" w:sz="1"/>
-              <w:bottom w:val="single" w:color="AAAAAA" w:sz="1"/>
-              <w:right w:val="single" w:color="AAAAAA" w:sz="1"/>
-            </w:tcBorders>
-            <w:shd w:fill="FFFFFF" w:val="clear"/>
-            <w:tcMar>
-              <w:top w:type="dxa" w:w="40"/>
-              <w:left w:type="dxa" w:w="80"/>
-              <w:bottom w:type="dxa" w:w="40"/>
-              <w:right w:type="dxa" w:w="80"/>
-            </w:tcMar>
-          </w:tcPr>
-          <w:p>
-            <w:pPr>
-              <w:spacing w:after="20" w:before="20" w:line="240" w:lineRule="auto"/>
-              <w:jc w:val="center"/>
-            </w:pPr>
-            <w:r>
-              <w:rPr>
-                <w:rFonts w:ascii="Arial" w:cs="Arial" w:eastAsia="Arial" w:hAnsi="Arial"/>
-                <w:b w:val="false"/>
-                <w:bCs w:val="false"/>
-                <w:i w:val="false"/>
-                <w:iCs w:val="false"/>
-                <w:sz w:val="18"/>
-                <w:szCs w:val="18"/>
-              </w:rPr>
-              <w:t xml:space="preserve">Souplesse 0,05</w:t>
-            </w:r>
-          </w:p>
-        </w:tc>
-        <w:tc>
-          <w:tcPr>
-            <w:tcW w:type="dxa" w:w="1466"/>
-            <w:tcBorders>
-              <w:top w:val="single" w:color="AAAAAA" w:sz="1"/>
-              <w:left w:val="single" w:color="AAAAAA" w:sz="1"/>
-              <w:bottom w:val="single" w:color="AAAAAA" w:sz="1"/>
-              <w:right w:val="single" w:color="AAAAAA" w:sz="1"/>
-            </w:tcBorders>
-            <w:shd w:fill="FFFFFF" w:val="clear"/>
-            <w:tcMar>
-              <w:top w:type="dxa" w:w="40"/>
-              <w:left w:type="dxa" w:w="80"/>
-              <w:bottom w:type="dxa" w:w="40"/>
-              <w:right w:type="dxa" w:w="80"/>
-            </w:tcMar>
-          </w:tcPr>
-          <w:p>
-            <w:pPr>
-              <w:spacing w:after="20" w:before="20" w:line="240" w:lineRule="auto"/>
-              <w:jc w:val="center"/>
-            </w:pPr>
-            <w:r>
-              <w:rPr>
-                <w:rFonts w:ascii="Arial" w:cs="Arial" w:eastAsia="Arial" w:hAnsi="Arial"/>
-                <w:b w:val="false"/>
-                <w:bCs w:val="false"/>
-                <w:i w:val="false"/>
-                <w:iCs w:val="false"/>
-                <w:sz w:val="18"/>
-                <w:szCs w:val="18"/>
-              </w:rPr>
-              <w:t xml:space="preserve">66 969 → 66 969</w:t>
             </w:r>
           </w:p>
         </w:tc>
@@ -41457,7 +41234,7 @@
       <w:tr>
         <w:tc>
           <w:tcPr>
-            <w:tcW w:type="dxa" w:w="2400"/>
+            <w:tcW w:type="dxa" w:w="3585"/>
             <w:tcBorders>
               <w:top w:val="single" w:color="AAAAAA" w:sz="1"/>
               <w:left w:val="single" w:color="AAAAAA" w:sz="1"/>
@@ -41493,7 +41270,7 @@
         </w:tc>
         <w:tc>
           <w:tcPr>
-            <w:tcW w:type="dxa" w:w="1800"/>
+            <w:tcW w:type="dxa" w:w="2689"/>
             <w:tcBorders>
               <w:top w:val="single" w:color="AAAAAA" w:sz="1"/>
               <w:left w:val="single" w:color="AAAAAA" w:sz="1"/>
@@ -41529,7 +41306,7 @@
         </w:tc>
         <w:tc>
           <w:tcPr>
-            <w:tcW w:type="dxa" w:w="1600"/>
+            <w:tcW w:type="dxa" w:w="2390"/>
             <w:tcBorders>
               <w:top w:val="single" w:color="AAAAAA" w:sz="1"/>
               <w:left w:val="single" w:color="AAAAAA" w:sz="1"/>
@@ -41560,78 +41337,6 @@
                 <w:szCs w:val="18"/>
               </w:rPr>
               <w:t xml:space="preserve">(7, 0, 1)</w:t>
-            </w:r>
-          </w:p>
-        </w:tc>
-        <w:tc>
-          <w:tcPr>
-            <w:tcW w:type="dxa" w:w="1400"/>
-            <w:tcBorders>
-              <w:top w:val="single" w:color="AAAAAA" w:sz="1"/>
-              <w:left w:val="single" w:color="AAAAAA" w:sz="1"/>
-              <w:bottom w:val="single" w:color="AAAAAA" w:sz="1"/>
-              <w:right w:val="single" w:color="AAAAAA" w:sz="1"/>
-            </w:tcBorders>
-            <w:shd w:fill="F9FBFD" w:val="clear"/>
-            <w:tcMar>
-              <w:top w:type="dxa" w:w="40"/>
-              <w:left w:type="dxa" w:w="80"/>
-              <w:bottom w:type="dxa" w:w="40"/>
-              <w:right w:type="dxa" w:w="80"/>
-            </w:tcMar>
-          </w:tcPr>
-          <w:p>
-            <w:pPr>
-              <w:spacing w:after="20" w:before="20" w:line="240" w:lineRule="auto"/>
-              <w:jc w:val="center"/>
-            </w:pPr>
-            <w:r>
-              <w:rPr>
-                <w:rFonts w:ascii="Arial" w:cs="Arial" w:eastAsia="Arial" w:hAnsi="Arial"/>
-                <w:b w:val="false"/>
-                <w:bCs w:val="false"/>
-                <w:i w:val="false"/>
-                <w:iCs w:val="false"/>
-                <w:sz w:val="18"/>
-                <w:szCs w:val="18"/>
-              </w:rPr>
-              <w:t xml:space="preserve">(7, 1, 1)</w:t>
-            </w:r>
-          </w:p>
-        </w:tc>
-        <w:tc>
-          <w:tcPr>
-            <w:tcW w:type="dxa" w:w="1466"/>
-            <w:tcBorders>
-              <w:top w:val="single" w:color="AAAAAA" w:sz="1"/>
-              <w:left w:val="single" w:color="AAAAAA" w:sz="1"/>
-              <w:bottom w:val="single" w:color="AAAAAA" w:sz="1"/>
-              <w:right w:val="single" w:color="AAAAAA" w:sz="1"/>
-            </w:tcBorders>
-            <w:shd w:fill="F9FBFD" w:val="clear"/>
-            <w:tcMar>
-              <w:top w:type="dxa" w:w="40"/>
-              <w:left w:type="dxa" w:w="80"/>
-              <w:bottom w:type="dxa" w:w="40"/>
-              <w:right w:type="dxa" w:w="80"/>
-            </w:tcMar>
-          </w:tcPr>
-          <w:p>
-            <w:pPr>
-              <w:spacing w:after="20" w:before="20" w:line="240" w:lineRule="auto"/>
-              <w:jc w:val="center"/>
-            </w:pPr>
-            <w:r>
-              <w:rPr>
-                <w:rFonts w:ascii="Arial" w:cs="Arial" w:eastAsia="Arial" w:hAnsi="Arial"/>
-                <w:b w:val="false"/>
-                <w:bCs w:val="false"/>
-                <w:i w:val="false"/>
-                <w:iCs w:val="false"/>
-                <w:sz w:val="18"/>
-                <w:szCs w:val="18"/>
-              </w:rPr>
-              <w:t xml:space="preserve">Choix par le critère AIC</w:t>
             </w:r>
           </w:p>
         </w:tc>
@@ -41639,7 +41344,7 @@
       <w:tr>
         <w:tc>
           <w:tcPr>
-            <w:tcW w:type="dxa" w:w="2400"/>
+            <w:tcW w:type="dxa" w:w="3585"/>
             <w:tcBorders>
               <w:top w:val="single" w:color="AAAAAA" w:sz="1"/>
               <w:left w:val="single" w:color="AAAAAA" w:sz="1"/>
@@ -41675,7 +41380,7 @@
         </w:tc>
         <w:tc>
           <w:tcPr>
-            <w:tcW w:type="dxa" w:w="1800"/>
+            <w:tcW w:type="dxa" w:w="2689"/>
             <w:tcBorders>
               <w:top w:val="single" w:color="AAAAAA" w:sz="1"/>
               <w:left w:val="single" w:color="AAAAAA" w:sz="1"/>
@@ -41711,79 +41416,7 @@
         </w:tc>
         <w:tc>
           <w:tcPr>
-            <w:tcW w:type="dxa" w:w="1600"/>
-            <w:tcBorders>
-              <w:top w:val="single" w:color="AAAAAA" w:sz="1"/>
-              <w:left w:val="single" w:color="AAAAAA" w:sz="1"/>
-              <w:bottom w:val="single" w:color="AAAAAA" w:sz="1"/>
-              <w:right w:val="single" w:color="AAAAAA" w:sz="1"/>
-            </w:tcBorders>
-            <w:shd w:fill="FFFFFF" w:val="clear"/>
-            <w:tcMar>
-              <w:top w:type="dxa" w:w="40"/>
-              <w:left w:type="dxa" w:w="80"/>
-              <w:bottom w:type="dxa" w:w="40"/>
-              <w:right w:type="dxa" w:w="80"/>
-            </w:tcMar>
-          </w:tcPr>
-          <w:p>
-            <w:pPr>
-              <w:spacing w:after="20" w:before="20" w:line="240" w:lineRule="auto"/>
-              <w:jc w:val="center"/>
-            </w:pPr>
-            <w:r>
-              <w:rPr>
-                <w:rFonts w:ascii="Arial" w:cs="Arial" w:eastAsia="Arial" w:hAnsi="Arial"/>
-                <w:b w:val="false"/>
-                <w:bCs w:val="false"/>
-                <w:i w:val="false"/>
-                <w:iCs w:val="false"/>
-                <w:sz w:val="18"/>
-                <w:szCs w:val="18"/>
-              </w:rPr>
-              <w:t xml:space="preserve">—</w:t>
-            </w:r>
-          </w:p>
-        </w:tc>
-        <w:tc>
-          <w:tcPr>
-            <w:tcW w:type="dxa" w:w="1400"/>
-            <w:tcBorders>
-              <w:top w:val="single" w:color="AAAAAA" w:sz="1"/>
-              <w:left w:val="single" w:color="AAAAAA" w:sz="1"/>
-              <w:bottom w:val="single" w:color="AAAAAA" w:sz="1"/>
-              <w:right w:val="single" w:color="AAAAAA" w:sz="1"/>
-            </w:tcBorders>
-            <w:shd w:fill="FFFFFF" w:val="clear"/>
-            <w:tcMar>
-              <w:top w:type="dxa" w:w="40"/>
-              <w:left w:type="dxa" w:w="80"/>
-              <w:bottom w:type="dxa" w:w="40"/>
-              <w:right w:type="dxa" w:w="80"/>
-            </w:tcMar>
-          </w:tcPr>
-          <w:p>
-            <w:pPr>
-              <w:spacing w:after="20" w:before="20" w:line="240" w:lineRule="auto"/>
-              <w:jc w:val="center"/>
-            </w:pPr>
-            <w:r>
-              <w:rPr>
-                <w:rFonts w:ascii="Arial" w:cs="Arial" w:eastAsia="Arial" w:hAnsi="Arial"/>
-                <w:b w:val="false"/>
-                <w:bCs w:val="false"/>
-                <w:i w:val="false"/>
-                <w:iCs w:val="false"/>
-                <w:sz w:val="18"/>
-                <w:szCs w:val="18"/>
-              </w:rPr>
-              <w:t xml:space="preserve">—</w:t>
-            </w:r>
-          </w:p>
-        </w:tc>
-        <w:tc>
-          <w:tcPr>
-            <w:tcW w:type="dxa" w:w="1466"/>
+            <w:tcW w:type="dxa" w:w="2390"/>
             <w:tcBorders>
               <w:top w:val="single" w:color="AAAAAA" w:sz="1"/>
               <w:left w:val="single" w:color="AAAAAA" w:sz="1"/>
@@ -41833,7 +41466,33 @@
           <w:sz w:val="20"/>
           <w:szCs w:val="20"/>
         </w:rPr>
-        <w:t xml:space="preserve">Tableau 5.7 : Réglages testés et résultats</w:t>
+        <w:t xml:space="preserve">Tableau 5.7 : Hyperparamètres des modèles</w:t>
+      </w:r>
+    </w:p>
+    <w:p>
+      <w:pPr>
+        <w:spacing w:after="40" w:before="40"/>
+      </w:pPr>
+      <w:r>
+        <w:t xml:space="preserve"/>
+      </w:r>
+    </w:p>
+    <w:p>
+      <w:pPr>
+        <w:pStyle w:val="Heading2"/>
+        <w:spacing w:after="90" w:before="200"/>
+        <w:outlineLvl w:val="1"/>
+      </w:pPr>
+      <w:r>
+        <w:rPr>
+          <w:rFonts w:ascii="Times New Roman" w:cs="Times New Roman" w:eastAsia="Times New Roman" w:hAnsi="Times New Roman"/>
+          <w:b/>
+          <w:bCs/>
+          <w:color w:val="000000"/>
+          <w:sz w:val="28"/>
+          <w:szCs w:val="28"/>
+        </w:rPr>
+        <w:t xml:space="preserve">5.7 Résultats comparatifs et sélection du modèle</w:t>
       </w:r>
     </w:p>
     <w:p>
@@ -41852,7 +41511,15 @@
           <w:sz w:val="24"/>
           <w:szCs w:val="24"/>
         </w:rPr>
-        <w:t xml:space="preserve">Le réglage réduit légèrement l'erreur en validation croisée, mais cet écart reste du même ordre que la variabilité de la production. Sur la période de validation N-1 (mai 2025), il ne profite qu'à ARIMA (tableau 5.8) :</w:t>
+        <w:t xml:space="preserve">Les quatre modèles ont été évalués avec leurs hyperparamètres par défaut, selon le même protocole. Le tableau 5.8 présente leurs erreurs en validation croisée (12 plis de 31 jours, du 20/03/2025 au 26/03/2026) :</w:t>
+      </w:r>
+    </w:p>
+    <w:p>
+      <w:pPr>
+        <w:spacing w:after="40" w:before="40"/>
+      </w:pPr>
+      <w:r>
+        <w:t xml:space="preserve"/>
       </w:r>
     </w:p>
     <w:tbl>
@@ -41869,10 +41536,12 @@
         </w:tblBorders>
       </w:tblPr>
       <w:tblGrid>
-        <w:gridCol w:w="2400"/>
-        <w:gridCol w:w="2400"/>
-        <w:gridCol w:w="1600"/>
-        <w:gridCol w:w="2266"/>
+        <w:gridCol w:w="1545"/>
+        <w:gridCol w:w="1116"/>
+        <w:gridCol w:w="1116"/>
+        <w:gridCol w:w="858"/>
+        <w:gridCol w:w="915"/>
+        <w:gridCol w:w="915"/>
       </w:tblGrid>
       <w:tr>
         <w:trPr>
@@ -41880,7 +41549,7 @@
         </w:trPr>
         <w:tc>
           <w:tcPr>
-            <w:tcW w:type="dxa" w:w="2400"/>
+            <w:tcW w:type="dxa" w:w="1545"/>
             <w:tcBorders>
               <w:top w:val="single" w:color="AAAAAA" w:sz="1"/>
               <w:left w:val="single" w:color="AAAAAA" w:sz="1"/>
@@ -41916,7 +41585,7 @@
         </w:tc>
         <w:tc>
           <w:tcPr>
-            <w:tcW w:type="dxa" w:w="2400"/>
+            <w:tcW w:type="dxa" w:w="1116"/>
             <w:tcBorders>
               <w:top w:val="single" w:color="AAAAAA" w:sz="1"/>
               <w:left w:val="single" w:color="AAAAAA" w:sz="1"/>
@@ -41946,13 +41615,13 @@
                 <w:sz w:val="19"/>
                 <w:szCs w:val="19"/>
               </w:rPr>
-              <w:t xml:space="preserve">MAE mai 2025 (valeurs par défaut)</w:t>
-            </w:r>
-          </w:p>
-        </w:tc>
-        <w:tc>
-          <w:tcPr>
-            <w:tcW w:type="dxa" w:w="1600"/>
+              <w:t xml:space="preserve">MAE (u/j)</w:t>
+            </w:r>
+          </w:p>
+        </w:tc>
+        <w:tc>
+          <w:tcPr>
+            <w:tcW w:type="dxa" w:w="1116"/>
             <w:tcBorders>
               <w:top w:val="single" w:color="AAAAAA" w:sz="1"/>
               <w:left w:val="single" w:color="AAAAAA" w:sz="1"/>
@@ -41982,13 +41651,13 @@
                 <w:sz w:val="19"/>
                 <w:szCs w:val="19"/>
               </w:rPr>
-              <w:t xml:space="preserve">MAE mai 2025 (valeurs réglées)</w:t>
-            </w:r>
-          </w:p>
-        </w:tc>
-        <w:tc>
-          <w:tcPr>
-            <w:tcW w:type="dxa" w:w="2266"/>
+              <w:t xml:space="preserve">RMSE (u/j)</w:t>
+            </w:r>
+          </w:p>
+        </w:tc>
+        <w:tc>
+          <w:tcPr>
+            <w:tcW w:type="dxa" w:w="858"/>
             <w:tcBorders>
               <w:top w:val="single" w:color="AAAAAA" w:sz="1"/>
               <w:left w:val="single" w:color="AAAAAA" w:sz="1"/>
@@ -42018,7 +41687,79 @@
                 <w:sz w:val="19"/>
                 <w:szCs w:val="19"/>
               </w:rPr>
-              <w:t xml:space="preserve">Écart</w:t>
+              <w:t xml:space="preserve">R²</w:t>
+            </w:r>
+          </w:p>
+        </w:tc>
+        <w:tc>
+          <w:tcPr>
+            <w:tcW w:type="dxa" w:w="915"/>
+            <w:tcBorders>
+              <w:top w:val="single" w:color="AAAAAA" w:sz="1"/>
+              <w:left w:val="single" w:color="AAAAAA" w:sz="1"/>
+              <w:bottom w:val="single" w:color="AAAAAA" w:sz="1"/>
+              <w:right w:val="single" w:color="AAAAAA" w:sz="1"/>
+            </w:tcBorders>
+            <w:shd w:fill="333333" w:val="clear"/>
+            <w:tcMar>
+              <w:top w:type="dxa" w:w="50"/>
+              <w:left w:type="dxa" w:w="80"/>
+              <w:bottom w:type="dxa" w:w="50"/>
+              <w:right w:type="dxa" w:w="80"/>
+            </w:tcMar>
+            <w:vAlign w:val="center"/>
+          </w:tcPr>
+          <w:p>
+            <w:pPr>
+              <w:spacing w:after="20" w:before="20"/>
+              <w:jc w:val="center"/>
+            </w:pPr>
+            <w:r>
+              <w:rPr>
+                <w:rFonts w:ascii="Arial" w:cs="Arial" w:eastAsia="Arial" w:hAnsi="Arial"/>
+                <w:b/>
+                <w:bCs/>
+                <w:color w:val="FFFFFF"/>
+                <w:sz w:val="19"/>
+                <w:szCs w:val="19"/>
+              </w:rPr>
+              <w:t xml:space="preserve">MAPE</w:t>
+            </w:r>
+          </w:p>
+        </w:tc>
+        <w:tc>
+          <w:tcPr>
+            <w:tcW w:type="dxa" w:w="915"/>
+            <w:tcBorders>
+              <w:top w:val="single" w:color="AAAAAA" w:sz="1"/>
+              <w:left w:val="single" w:color="AAAAAA" w:sz="1"/>
+              <w:bottom w:val="single" w:color="AAAAAA" w:sz="1"/>
+              <w:right w:val="single" w:color="AAAAAA" w:sz="1"/>
+            </w:tcBorders>
+            <w:shd w:fill="333333" w:val="clear"/>
+            <w:tcMar>
+              <w:top w:type="dxa" w:w="50"/>
+              <w:left w:type="dxa" w:w="80"/>
+              <w:bottom w:type="dxa" w:w="50"/>
+              <w:right w:type="dxa" w:w="80"/>
+            </w:tcMar>
+            <w:vAlign w:val="center"/>
+          </w:tcPr>
+          <w:p>
+            <w:pPr>
+              <w:spacing w:after="20" w:before="20"/>
+              <w:jc w:val="center"/>
+            </w:pPr>
+            <w:r>
+              <w:rPr>
+                <w:rFonts w:ascii="Arial" w:cs="Arial" w:eastAsia="Arial" w:hAnsi="Arial"/>
+                <w:b/>
+                <w:bCs/>
+                <w:color w:val="FFFFFF"/>
+                <w:sz w:val="19"/>
+                <w:szCs w:val="19"/>
+              </w:rPr>
+              <w:t xml:space="preserve">Écart de volume</w:t>
             </w:r>
           </w:p>
         </w:tc>
@@ -42026,7 +41767,7 @@
       <w:tr>
         <w:tc>
           <w:tcPr>
-            <w:tcW w:type="dxa" w:w="2400"/>
+            <w:tcW w:type="dxa" w:w="1545"/>
             <w:tcBorders>
               <w:top w:val="single" w:color="AAAAAA" w:sz="1"/>
               <w:left w:val="single" w:color="AAAAAA" w:sz="1"/>
@@ -42056,13 +41797,13 @@
                 <w:sz w:val="18"/>
                 <w:szCs w:val="18"/>
               </w:rPr>
-              <w:t xml:space="preserve">Random Forest</w:t>
-            </w:r>
-          </w:p>
-        </w:tc>
-        <w:tc>
-          <w:tcPr>
-            <w:tcW w:type="dxa" w:w="2400"/>
+              <w:t xml:space="preserve">Random Forest (retenu)</w:t>
+            </w:r>
+          </w:p>
+        </w:tc>
+        <w:tc>
+          <w:tcPr>
+            <w:tcW w:type="dxa" w:w="1116"/>
             <w:tcBorders>
               <w:top w:val="single" w:color="AAAAAA" w:sz="1"/>
               <w:left w:val="single" w:color="AAAAAA" w:sz="1"/>
@@ -42092,13 +41833,13 @@
                 <w:sz w:val="18"/>
                 <w:szCs w:val="18"/>
               </w:rPr>
-              <w:t xml:space="preserve">33 614 u/j</w:t>
-            </w:r>
-          </w:p>
-        </w:tc>
-        <w:tc>
-          <w:tcPr>
-            <w:tcW w:type="dxa" w:w="1600"/>
+              <w:t xml:space="preserve">57 079</w:t>
+            </w:r>
+          </w:p>
+        </w:tc>
+        <w:tc>
+          <w:tcPr>
+            <w:tcW w:type="dxa" w:w="1116"/>
             <w:tcBorders>
               <w:top w:val="single" w:color="AAAAAA" w:sz="1"/>
               <w:left w:val="single" w:color="AAAAAA" w:sz="1"/>
@@ -42128,13 +41869,13 @@
                 <w:sz w:val="18"/>
                 <w:szCs w:val="18"/>
               </w:rPr>
-              <w:t xml:space="preserve">33 697 u/j</w:t>
-            </w:r>
-          </w:p>
-        </w:tc>
-        <w:tc>
-          <w:tcPr>
-            <w:tcW w:type="dxa" w:w="2266"/>
+              <w:t xml:space="preserve">82 632</w:t>
+            </w:r>
+          </w:p>
+        </w:tc>
+        <w:tc>
+          <w:tcPr>
+            <w:tcW w:type="dxa" w:w="858"/>
             <w:tcBorders>
               <w:top w:val="single" w:color="AAAAAA" w:sz="1"/>
               <w:left w:val="single" w:color="AAAAAA" w:sz="1"/>
@@ -42152,19 +41893,91 @@
           <w:p>
             <w:pPr>
               <w:spacing w:after="20" w:before="20" w:line="240" w:lineRule="auto"/>
-              <w:jc w:val="left"/>
-            </w:pPr>
-            <w:r>
-              <w:rPr>
-                <w:rFonts w:ascii="Arial" w:cs="Arial" w:eastAsia="Arial" w:hAnsi="Arial"/>
-                <w:b w:val="false"/>
-                <w:bCs w:val="false"/>
-                <w:i w:val="false"/>
-                <w:iCs w:val="false"/>
-                <w:sz w:val="18"/>
-                <w:szCs w:val="18"/>
-              </w:rPr>
-              <w:t xml:space="preserve">+83 u/j</w:t>
+              <w:jc w:val="center"/>
+            </w:pPr>
+            <w:r>
+              <w:rPr>
+                <w:rFonts w:ascii="Arial" w:cs="Arial" w:eastAsia="Arial" w:hAnsi="Arial"/>
+                <w:b w:val="false"/>
+                <w:bCs w:val="false"/>
+                <w:i w:val="false"/>
+                <w:iCs w:val="false"/>
+                <w:sz w:val="18"/>
+                <w:szCs w:val="18"/>
+              </w:rPr>
+              <w:t xml:space="preserve">0,452</w:t>
+            </w:r>
+          </w:p>
+        </w:tc>
+        <w:tc>
+          <w:tcPr>
+            <w:tcW w:type="dxa" w:w="915"/>
+            <w:tcBorders>
+              <w:top w:val="single" w:color="AAAAAA" w:sz="1"/>
+              <w:left w:val="single" w:color="AAAAAA" w:sz="1"/>
+              <w:bottom w:val="single" w:color="AAAAAA" w:sz="1"/>
+              <w:right w:val="single" w:color="AAAAAA" w:sz="1"/>
+            </w:tcBorders>
+            <w:shd w:fill="F9FBFD" w:val="clear"/>
+            <w:tcMar>
+              <w:top w:type="dxa" w:w="40"/>
+              <w:left w:type="dxa" w:w="80"/>
+              <w:bottom w:type="dxa" w:w="40"/>
+              <w:right w:type="dxa" w:w="80"/>
+            </w:tcMar>
+          </w:tcPr>
+          <w:p>
+            <w:pPr>
+              <w:spacing w:after="20" w:before="20" w:line="240" w:lineRule="auto"/>
+              <w:jc w:val="center"/>
+            </w:pPr>
+            <w:r>
+              <w:rPr>
+                <w:rFonts w:ascii="Arial" w:cs="Arial" w:eastAsia="Arial" w:hAnsi="Arial"/>
+                <w:b w:val="false"/>
+                <w:bCs w:val="false"/>
+                <w:i w:val="false"/>
+                <w:iCs w:val="false"/>
+                <w:sz w:val="18"/>
+                <w:szCs w:val="18"/>
+              </w:rPr>
+              <w:t xml:space="preserve">38,2 %</w:t>
+            </w:r>
+          </w:p>
+        </w:tc>
+        <w:tc>
+          <w:tcPr>
+            <w:tcW w:type="dxa" w:w="915"/>
+            <w:tcBorders>
+              <w:top w:val="single" w:color="AAAAAA" w:sz="1"/>
+              <w:left w:val="single" w:color="AAAAAA" w:sz="1"/>
+              <w:bottom w:val="single" w:color="AAAAAA" w:sz="1"/>
+              <w:right w:val="single" w:color="AAAAAA" w:sz="1"/>
+            </w:tcBorders>
+            <w:shd w:fill="F9FBFD" w:val="clear"/>
+            <w:tcMar>
+              <w:top w:type="dxa" w:w="40"/>
+              <w:left w:type="dxa" w:w="80"/>
+              <w:bottom w:type="dxa" w:w="40"/>
+              <w:right w:type="dxa" w:w="80"/>
+            </w:tcMar>
+          </w:tcPr>
+          <w:p>
+            <w:pPr>
+              <w:spacing w:after="20" w:before="20" w:line="240" w:lineRule="auto"/>
+              <w:jc w:val="center"/>
+            </w:pPr>
+            <w:r>
+              <w:rPr>
+                <w:rFonts w:ascii="Arial" w:cs="Arial" w:eastAsia="Arial" w:hAnsi="Arial"/>
+                <w:b w:val="false"/>
+                <w:bCs w:val="false"/>
+                <w:i w:val="false"/>
+                <w:iCs w:val="false"/>
+                <w:sz w:val="18"/>
+                <w:szCs w:val="18"/>
+              </w:rPr>
+              <w:t xml:space="preserve">9,6 %</w:t>
             </w:r>
           </w:p>
         </w:tc>
@@ -42172,7 +41985,7 @@
       <w:tr>
         <w:tc>
           <w:tcPr>
-            <w:tcW w:type="dxa" w:w="2400"/>
+            <w:tcW w:type="dxa" w:w="1545"/>
             <w:tcBorders>
               <w:top w:val="single" w:color="AAAAAA" w:sz="1"/>
               <w:left w:val="single" w:color="AAAAAA" w:sz="1"/>
@@ -42208,7 +42021,7 @@
         </w:tc>
         <w:tc>
           <w:tcPr>
-            <w:tcW w:type="dxa" w:w="2400"/>
+            <w:tcW w:type="dxa" w:w="1116"/>
             <w:tcBorders>
               <w:top w:val="single" w:color="AAAAAA" w:sz="1"/>
               <w:left w:val="single" w:color="AAAAAA" w:sz="1"/>
@@ -42238,13 +42051,13 @@
                 <w:sz w:val="18"/>
                 <w:szCs w:val="18"/>
               </w:rPr>
-              <w:t xml:space="preserve">65 937 u/j</w:t>
-            </w:r>
-          </w:p>
-        </w:tc>
-        <w:tc>
-          <w:tcPr>
-            <w:tcW w:type="dxa" w:w="1600"/>
+              <w:t xml:space="preserve">58 420</w:t>
+            </w:r>
+          </w:p>
+        </w:tc>
+        <w:tc>
+          <w:tcPr>
+            <w:tcW w:type="dxa" w:w="1116"/>
             <w:tcBorders>
               <w:top w:val="single" w:color="AAAAAA" w:sz="1"/>
               <w:left w:val="single" w:color="AAAAAA" w:sz="1"/>
@@ -42274,13 +42087,13 @@
                 <w:sz w:val="18"/>
                 <w:szCs w:val="18"/>
               </w:rPr>
-              <w:t xml:space="preserve">65 937 u/j</w:t>
-            </w:r>
-          </w:p>
-        </w:tc>
-        <w:tc>
-          <w:tcPr>
-            <w:tcW w:type="dxa" w:w="2266"/>
+              <w:t xml:space="preserve">82 000</w:t>
+            </w:r>
+          </w:p>
+        </w:tc>
+        <w:tc>
+          <w:tcPr>
+            <w:tcW w:type="dxa" w:w="858"/>
             <w:tcBorders>
               <w:top w:val="single" w:color="AAAAAA" w:sz="1"/>
               <w:left w:val="single" w:color="AAAAAA" w:sz="1"/>
@@ -42298,19 +42111,91 @@
           <w:p>
             <w:pPr>
               <w:spacing w:after="20" w:before="20" w:line="240" w:lineRule="auto"/>
-              <w:jc w:val="left"/>
-            </w:pPr>
-            <w:r>
-              <w:rPr>
-                <w:rFonts w:ascii="Arial" w:cs="Arial" w:eastAsia="Arial" w:hAnsi="Arial"/>
-                <w:b w:val="false"/>
-                <w:bCs w:val="false"/>
-                <w:i w:val="false"/>
-                <w:iCs w:val="false"/>
-                <w:sz w:val="18"/>
-                <w:szCs w:val="18"/>
-              </w:rPr>
-              <w:t xml:space="preserve">0 (aucun changement)</w:t>
+              <w:jc w:val="center"/>
+            </w:pPr>
+            <w:r>
+              <w:rPr>
+                <w:rFonts w:ascii="Arial" w:cs="Arial" w:eastAsia="Arial" w:hAnsi="Arial"/>
+                <w:b w:val="false"/>
+                <w:bCs w:val="false"/>
+                <w:i w:val="false"/>
+                <w:iCs w:val="false"/>
+                <w:sz w:val="18"/>
+                <w:szCs w:val="18"/>
+              </w:rPr>
+              <w:t xml:space="preserve">0,460</w:t>
+            </w:r>
+          </w:p>
+        </w:tc>
+        <w:tc>
+          <w:tcPr>
+            <w:tcW w:type="dxa" w:w="915"/>
+            <w:tcBorders>
+              <w:top w:val="single" w:color="AAAAAA" w:sz="1"/>
+              <w:left w:val="single" w:color="AAAAAA" w:sz="1"/>
+              <w:bottom w:val="single" w:color="AAAAAA" w:sz="1"/>
+              <w:right w:val="single" w:color="AAAAAA" w:sz="1"/>
+            </w:tcBorders>
+            <w:shd w:fill="FFFFFF" w:val="clear"/>
+            <w:tcMar>
+              <w:top w:type="dxa" w:w="40"/>
+              <w:left w:type="dxa" w:w="80"/>
+              <w:bottom w:type="dxa" w:w="40"/>
+              <w:right w:type="dxa" w:w="80"/>
+            </w:tcMar>
+          </w:tcPr>
+          <w:p>
+            <w:pPr>
+              <w:spacing w:after="20" w:before="20" w:line="240" w:lineRule="auto"/>
+              <w:jc w:val="center"/>
+            </w:pPr>
+            <w:r>
+              <w:rPr>
+                <w:rFonts w:ascii="Arial" w:cs="Arial" w:eastAsia="Arial" w:hAnsi="Arial"/>
+                <w:b w:val="false"/>
+                <w:bCs w:val="false"/>
+                <w:i w:val="false"/>
+                <w:iCs w:val="false"/>
+                <w:sz w:val="18"/>
+                <w:szCs w:val="18"/>
+              </w:rPr>
+              <w:t xml:space="preserve">36,8 %</w:t>
+            </w:r>
+          </w:p>
+        </w:tc>
+        <w:tc>
+          <w:tcPr>
+            <w:tcW w:type="dxa" w:w="915"/>
+            <w:tcBorders>
+              <w:top w:val="single" w:color="AAAAAA" w:sz="1"/>
+              <w:left w:val="single" w:color="AAAAAA" w:sz="1"/>
+              <w:bottom w:val="single" w:color="AAAAAA" w:sz="1"/>
+              <w:right w:val="single" w:color="AAAAAA" w:sz="1"/>
+            </w:tcBorders>
+            <w:shd w:fill="FFFFFF" w:val="clear"/>
+            <w:tcMar>
+              <w:top w:type="dxa" w:w="40"/>
+              <w:left w:type="dxa" w:w="80"/>
+              <w:bottom w:type="dxa" w:w="40"/>
+              <w:right w:type="dxa" w:w="80"/>
+            </w:tcMar>
+          </w:tcPr>
+          <w:p>
+            <w:pPr>
+              <w:spacing w:after="20" w:before="20" w:line="240" w:lineRule="auto"/>
+              <w:jc w:val="center"/>
+            </w:pPr>
+            <w:r>
+              <w:rPr>
+                <w:rFonts w:ascii="Arial" w:cs="Arial" w:eastAsia="Arial" w:hAnsi="Arial"/>
+                <w:b w:val="false"/>
+                <w:bCs w:val="false"/>
+                <w:i w:val="false"/>
+                <w:iCs w:val="false"/>
+                <w:sz w:val="18"/>
+                <w:szCs w:val="18"/>
+              </w:rPr>
+              <w:t xml:space="preserve">8,6 %</w:t>
             </w:r>
           </w:p>
         </w:tc>
@@ -42318,7 +42203,7 @@
       <w:tr>
         <w:tc>
           <w:tcPr>
-            <w:tcW w:type="dxa" w:w="2400"/>
+            <w:tcW w:type="dxa" w:w="1545"/>
             <w:tcBorders>
               <w:top w:val="single" w:color="AAAAAA" w:sz="1"/>
               <w:left w:val="single" w:color="AAAAAA" w:sz="1"/>
@@ -42354,7 +42239,7 @@
         </w:tc>
         <w:tc>
           <w:tcPr>
-            <w:tcW w:type="dxa" w:w="2400"/>
+            <w:tcW w:type="dxa" w:w="1116"/>
             <w:tcBorders>
               <w:top w:val="single" w:color="AAAAAA" w:sz="1"/>
               <w:left w:val="single" w:color="AAAAAA" w:sz="1"/>
@@ -42384,13 +42269,13 @@
                 <w:sz w:val="18"/>
                 <w:szCs w:val="18"/>
               </w:rPr>
-              <w:t xml:space="preserve">60 583 u/j</w:t>
-            </w:r>
-          </w:p>
-        </w:tc>
-        <w:tc>
-          <w:tcPr>
-            <w:tcW w:type="dxa" w:w="1600"/>
+              <w:t xml:space="preserve">73 340</w:t>
+            </w:r>
+          </w:p>
+        </w:tc>
+        <w:tc>
+          <w:tcPr>
+            <w:tcW w:type="dxa" w:w="1116"/>
             <w:tcBorders>
               <w:top w:val="single" w:color="AAAAAA" w:sz="1"/>
               <w:left w:val="single" w:color="AAAAAA" w:sz="1"/>
@@ -42420,13 +42305,13 @@
                 <w:sz w:val="18"/>
                 <w:szCs w:val="18"/>
               </w:rPr>
-              <w:t xml:space="preserve">50 211 u/j</w:t>
-            </w:r>
-          </w:p>
-        </w:tc>
-        <w:tc>
-          <w:tcPr>
-            <w:tcW w:type="dxa" w:w="2266"/>
+              <w:t xml:space="preserve">100 318</w:t>
+            </w:r>
+          </w:p>
+        </w:tc>
+        <w:tc>
+          <w:tcPr>
+            <w:tcW w:type="dxa" w:w="858"/>
             <w:tcBorders>
               <w:top w:val="single" w:color="AAAAAA" w:sz="1"/>
               <w:left w:val="single" w:color="AAAAAA" w:sz="1"/>
@@ -42444,19 +42329,91 @@
           <w:p>
             <w:pPr>
               <w:spacing w:after="20" w:before="20" w:line="240" w:lineRule="auto"/>
-              <w:jc w:val="left"/>
-            </w:pPr>
-            <w:r>
-              <w:rPr>
-                <w:rFonts w:ascii="Arial" w:cs="Arial" w:eastAsia="Arial" w:hAnsi="Arial"/>
-                <w:b w:val="false"/>
-                <w:bCs w:val="false"/>
-                <w:i w:val="false"/>
-                <w:iCs w:val="false"/>
-                <w:sz w:val="18"/>
-                <w:szCs w:val="18"/>
-              </w:rPr>
-              <w:t xml:space="preserve">−10 372 u/j</w:t>
+              <w:jc w:val="center"/>
+            </w:pPr>
+            <w:r>
+              <w:rPr>
+                <w:rFonts w:ascii="Arial" w:cs="Arial" w:eastAsia="Arial" w:hAnsi="Arial"/>
+                <w:b w:val="false"/>
+                <w:bCs w:val="false"/>
+                <w:i w:val="false"/>
+                <w:iCs w:val="false"/>
+                <w:sz w:val="18"/>
+                <w:szCs w:val="18"/>
+              </w:rPr>
+              <w:t xml:space="preserve">0,192</w:t>
+            </w:r>
+          </w:p>
+        </w:tc>
+        <w:tc>
+          <w:tcPr>
+            <w:tcW w:type="dxa" w:w="915"/>
+            <w:tcBorders>
+              <w:top w:val="single" w:color="AAAAAA" w:sz="1"/>
+              <w:left w:val="single" w:color="AAAAAA" w:sz="1"/>
+              <w:bottom w:val="single" w:color="AAAAAA" w:sz="1"/>
+              <w:right w:val="single" w:color="AAAAAA" w:sz="1"/>
+            </w:tcBorders>
+            <w:shd w:fill="F9FBFD" w:val="clear"/>
+            <w:tcMar>
+              <w:top w:type="dxa" w:w="40"/>
+              <w:left w:type="dxa" w:w="80"/>
+              <w:bottom w:type="dxa" w:w="40"/>
+              <w:right w:type="dxa" w:w="80"/>
+            </w:tcMar>
+          </w:tcPr>
+          <w:p>
+            <w:pPr>
+              <w:spacing w:after="20" w:before="20" w:line="240" w:lineRule="auto"/>
+              <w:jc w:val="center"/>
+            </w:pPr>
+            <w:r>
+              <w:rPr>
+                <w:rFonts w:ascii="Arial" w:cs="Arial" w:eastAsia="Arial" w:hAnsi="Arial"/>
+                <w:b w:val="false"/>
+                <w:bCs w:val="false"/>
+                <w:i w:val="false"/>
+                <w:iCs w:val="false"/>
+                <w:sz w:val="18"/>
+                <w:szCs w:val="18"/>
+              </w:rPr>
+              <w:t xml:space="preserve">48,0 %</w:t>
+            </w:r>
+          </w:p>
+        </w:tc>
+        <w:tc>
+          <w:tcPr>
+            <w:tcW w:type="dxa" w:w="915"/>
+            <w:tcBorders>
+              <w:top w:val="single" w:color="AAAAAA" w:sz="1"/>
+              <w:left w:val="single" w:color="AAAAAA" w:sz="1"/>
+              <w:bottom w:val="single" w:color="AAAAAA" w:sz="1"/>
+              <w:right w:val="single" w:color="AAAAAA" w:sz="1"/>
+            </w:tcBorders>
+            <w:shd w:fill="F9FBFD" w:val="clear"/>
+            <w:tcMar>
+              <w:top w:type="dxa" w:w="40"/>
+              <w:left w:type="dxa" w:w="80"/>
+              <w:bottom w:type="dxa" w:w="40"/>
+              <w:right w:type="dxa" w:w="80"/>
+            </w:tcMar>
+          </w:tcPr>
+          <w:p>
+            <w:pPr>
+              <w:spacing w:after="20" w:before="20" w:line="240" w:lineRule="auto"/>
+              <w:jc w:val="center"/>
+            </w:pPr>
+            <w:r>
+              <w:rPr>
+                <w:rFonts w:ascii="Arial" w:cs="Arial" w:eastAsia="Arial" w:hAnsi="Arial"/>
+                <w:b w:val="false"/>
+                <w:bCs w:val="false"/>
+                <w:i w:val="false"/>
+                <w:iCs w:val="false"/>
+                <w:sz w:val="18"/>
+                <w:szCs w:val="18"/>
+              </w:rPr>
+              <w:t xml:space="preserve">12,7 %</w:t>
             </w:r>
           </w:p>
         </w:tc>
@@ -42464,14 +42421,14 @@
       <w:tr>
         <w:tc>
           <w:tcPr>
-            <w:tcW w:type="dxa" w:w="2400"/>
-            <w:tcBorders>
-              <w:top w:val="single" w:color="AAAAAA" w:sz="1"/>
-              <w:left w:val="single" w:color="AAAAAA" w:sz="1"/>
-              <w:bottom w:val="single" w:color="AAAAAA" w:sz="1"/>
-              <w:right w:val="single" w:color="AAAAAA" w:sz="1"/>
-            </w:tcBorders>
-            <w:shd w:fill="F9FBFD" w:val="clear"/>
+            <w:tcW w:type="dxa" w:w="1545"/>
+            <w:tcBorders>
+              <w:top w:val="single" w:color="AAAAAA" w:sz="1"/>
+              <w:left w:val="single" w:color="AAAAAA" w:sz="1"/>
+              <w:bottom w:val="single" w:color="AAAAAA" w:sz="1"/>
+              <w:right w:val="single" w:color="AAAAAA" w:sz="1"/>
+            </w:tcBorders>
+            <w:shd w:fill="FFFFFF" w:val="clear"/>
             <w:tcMar>
               <w:top w:type="dxa" w:w="40"/>
               <w:left w:type="dxa" w:w="80"/>
@@ -42500,14 +42457,14 @@
         </w:tc>
         <w:tc>
           <w:tcPr>
-            <w:tcW w:type="dxa" w:w="2400"/>
-            <w:tcBorders>
-              <w:top w:val="single" w:color="AAAAAA" w:sz="1"/>
-              <w:left w:val="single" w:color="AAAAAA" w:sz="1"/>
-              <w:bottom w:val="single" w:color="AAAAAA" w:sz="1"/>
-              <w:right w:val="single" w:color="AAAAAA" w:sz="1"/>
-            </w:tcBorders>
-            <w:shd w:fill="F9FBFD" w:val="clear"/>
+            <w:tcW w:type="dxa" w:w="1116"/>
+            <w:tcBorders>
+              <w:top w:val="single" w:color="AAAAAA" w:sz="1"/>
+              <w:left w:val="single" w:color="AAAAAA" w:sz="1"/>
+              <w:bottom w:val="single" w:color="AAAAAA" w:sz="1"/>
+              <w:right w:val="single" w:color="AAAAAA" w:sz="1"/>
+            </w:tcBorders>
+            <w:shd w:fill="FFFFFF" w:val="clear"/>
             <w:tcMar>
               <w:top w:type="dxa" w:w="40"/>
               <w:left w:type="dxa" w:w="80"/>
@@ -42530,20 +42487,20 @@
                 <w:sz w:val="18"/>
                 <w:szCs w:val="18"/>
               </w:rPr>
-              <w:t xml:space="preserve">79 908 u/j</w:t>
-            </w:r>
-          </w:p>
-        </w:tc>
-        <w:tc>
-          <w:tcPr>
-            <w:tcW w:type="dxa" w:w="1600"/>
-            <w:tcBorders>
-              <w:top w:val="single" w:color="AAAAAA" w:sz="1"/>
-              <w:left w:val="single" w:color="AAAAAA" w:sz="1"/>
-              <w:bottom w:val="single" w:color="AAAAAA" w:sz="1"/>
-              <w:right w:val="single" w:color="AAAAAA" w:sz="1"/>
-            </w:tcBorders>
-            <w:shd w:fill="F9FBFD" w:val="clear"/>
+              <w:t xml:space="preserve">83 686</w:t>
+            </w:r>
+          </w:p>
+        </w:tc>
+        <w:tc>
+          <w:tcPr>
+            <w:tcW w:type="dxa" w:w="1116"/>
+            <w:tcBorders>
+              <w:top w:val="single" w:color="AAAAAA" w:sz="1"/>
+              <w:left w:val="single" w:color="AAAAAA" w:sz="1"/>
+              <w:bottom w:val="single" w:color="AAAAAA" w:sz="1"/>
+              <w:right w:val="single" w:color="AAAAAA" w:sz="1"/>
+            </w:tcBorders>
+            <w:shd w:fill="FFFFFF" w:val="clear"/>
             <w:tcMar>
               <w:top w:type="dxa" w:w="40"/>
               <w:left w:type="dxa" w:w="80"/>
@@ -42566,43 +42523,115 @@
                 <w:sz w:val="18"/>
                 <w:szCs w:val="18"/>
               </w:rPr>
-              <w:t xml:space="preserve">79 908 u/j</w:t>
-            </w:r>
-          </w:p>
-        </w:tc>
-        <w:tc>
-          <w:tcPr>
-            <w:tcW w:type="dxa" w:w="2266"/>
-            <w:tcBorders>
-              <w:top w:val="single" w:color="AAAAAA" w:sz="1"/>
-              <w:left w:val="single" w:color="AAAAAA" w:sz="1"/>
-              <w:bottom w:val="single" w:color="AAAAAA" w:sz="1"/>
-              <w:right w:val="single" w:color="AAAAAA" w:sz="1"/>
-            </w:tcBorders>
-            <w:shd w:fill="F9FBFD" w:val="clear"/>
-            <w:tcMar>
-              <w:top w:type="dxa" w:w="40"/>
-              <w:left w:type="dxa" w:w="80"/>
-              <w:bottom w:type="dxa" w:w="40"/>
-              <w:right w:type="dxa" w:w="80"/>
-            </w:tcMar>
-          </w:tcPr>
-          <w:p>
-            <w:pPr>
-              <w:spacing w:after="20" w:before="20" w:line="240" w:lineRule="auto"/>
-              <w:jc w:val="left"/>
-            </w:pPr>
-            <w:r>
-              <w:rPr>
-                <w:rFonts w:ascii="Arial" w:cs="Arial" w:eastAsia="Arial" w:hAnsi="Arial"/>
-                <w:b w:val="false"/>
-                <w:bCs w:val="false"/>
-                <w:i w:val="false"/>
-                <w:iCs w:val="false"/>
-                <w:sz w:val="18"/>
-                <w:szCs w:val="18"/>
-              </w:rPr>
-              <w:t xml:space="preserve">0 (aucun réglage)</w:t>
+              <w:t xml:space="preserve">106 578</w:t>
+            </w:r>
+          </w:p>
+        </w:tc>
+        <w:tc>
+          <w:tcPr>
+            <w:tcW w:type="dxa" w:w="858"/>
+            <w:tcBorders>
+              <w:top w:val="single" w:color="AAAAAA" w:sz="1"/>
+              <w:left w:val="single" w:color="AAAAAA" w:sz="1"/>
+              <w:bottom w:val="single" w:color="AAAAAA" w:sz="1"/>
+              <w:right w:val="single" w:color="AAAAAA" w:sz="1"/>
+            </w:tcBorders>
+            <w:shd w:fill="FFFFFF" w:val="clear"/>
+            <w:tcMar>
+              <w:top w:type="dxa" w:w="40"/>
+              <w:left w:type="dxa" w:w="80"/>
+              <w:bottom w:type="dxa" w:w="40"/>
+              <w:right w:type="dxa" w:w="80"/>
+            </w:tcMar>
+          </w:tcPr>
+          <w:p>
+            <w:pPr>
+              <w:spacing w:after="20" w:before="20" w:line="240" w:lineRule="auto"/>
+              <w:jc w:val="center"/>
+            </w:pPr>
+            <w:r>
+              <w:rPr>
+                <w:rFonts w:ascii="Arial" w:cs="Arial" w:eastAsia="Arial" w:hAnsi="Arial"/>
+                <w:b w:val="false"/>
+                <w:bCs w:val="false"/>
+                <w:i w:val="false"/>
+                <w:iCs w:val="false"/>
+                <w:sz w:val="18"/>
+                <w:szCs w:val="18"/>
+              </w:rPr>
+              <w:t xml:space="preserve">0,088</w:t>
+            </w:r>
+          </w:p>
+        </w:tc>
+        <w:tc>
+          <w:tcPr>
+            <w:tcW w:type="dxa" w:w="915"/>
+            <w:tcBorders>
+              <w:top w:val="single" w:color="AAAAAA" w:sz="1"/>
+              <w:left w:val="single" w:color="AAAAAA" w:sz="1"/>
+              <w:bottom w:val="single" w:color="AAAAAA" w:sz="1"/>
+              <w:right w:val="single" w:color="AAAAAA" w:sz="1"/>
+            </w:tcBorders>
+            <w:shd w:fill="FFFFFF" w:val="clear"/>
+            <w:tcMar>
+              <w:top w:type="dxa" w:w="40"/>
+              <w:left w:type="dxa" w:w="80"/>
+              <w:bottom w:type="dxa" w:w="40"/>
+              <w:right w:type="dxa" w:w="80"/>
+            </w:tcMar>
+          </w:tcPr>
+          <w:p>
+            <w:pPr>
+              <w:spacing w:after="20" w:before="20" w:line="240" w:lineRule="auto"/>
+              <w:jc w:val="center"/>
+            </w:pPr>
+            <w:r>
+              <w:rPr>
+                <w:rFonts w:ascii="Arial" w:cs="Arial" w:eastAsia="Arial" w:hAnsi="Arial"/>
+                <w:b w:val="false"/>
+                <w:bCs w:val="false"/>
+                <w:i w:val="false"/>
+                <w:iCs w:val="false"/>
+                <w:sz w:val="18"/>
+                <w:szCs w:val="18"/>
+              </w:rPr>
+              <w:t xml:space="preserve">54,8 %</w:t>
+            </w:r>
+          </w:p>
+        </w:tc>
+        <w:tc>
+          <w:tcPr>
+            <w:tcW w:type="dxa" w:w="915"/>
+            <w:tcBorders>
+              <w:top w:val="single" w:color="AAAAAA" w:sz="1"/>
+              <w:left w:val="single" w:color="AAAAAA" w:sz="1"/>
+              <w:bottom w:val="single" w:color="AAAAAA" w:sz="1"/>
+              <w:right w:val="single" w:color="AAAAAA" w:sz="1"/>
+            </w:tcBorders>
+            <w:shd w:fill="FFFFFF" w:val="clear"/>
+            <w:tcMar>
+              <w:top w:type="dxa" w:w="40"/>
+              <w:left w:type="dxa" w:w="80"/>
+              <w:bottom w:type="dxa" w:w="40"/>
+              <w:right w:type="dxa" w:w="80"/>
+            </w:tcMar>
+          </w:tcPr>
+          <w:p>
+            <w:pPr>
+              <w:spacing w:after="20" w:before="20" w:line="240" w:lineRule="auto"/>
+              <w:jc w:val="center"/>
+            </w:pPr>
+            <w:r>
+              <w:rPr>
+                <w:rFonts w:ascii="Arial" w:cs="Arial" w:eastAsia="Arial" w:hAnsi="Arial"/>
+                <w:b w:val="false"/>
+                <w:bCs w:val="false"/>
+                <w:i w:val="false"/>
+                <w:iCs w:val="false"/>
+                <w:sz w:val="18"/>
+                <w:szCs w:val="18"/>
+              </w:rPr>
+              <w:t xml:space="preserve">9,3 %</w:t>
             </w:r>
           </w:p>
         </w:tc>
@@ -42622,7 +42651,15 @@
           <w:sz w:val="20"/>
           <w:szCs w:val="20"/>
         </w:rPr>
-        <w:t xml:space="preserve">Tableau 5.8 : Effet du réglage sur la validation N-1 (mai 2025)</w:t>
+        <w:t xml:space="preserve">Tableau 5.8 : Performances des modèles en validation croisée</w:t>
+      </w:r>
+    </w:p>
+    <w:p>
+      <w:pPr>
+        <w:spacing w:after="40" w:before="40"/>
+      </w:pPr>
+      <w:r>
+        <w:t xml:space="preserve"/>
       </w:r>
     </w:p>
     <w:p>
@@ -42641,1057 +42678,7 @@
           <w:sz w:val="24"/>
           <w:szCs w:val="24"/>
         </w:rPr>
-        <w:t xml:space="preserve">Pour Random Forest, le réglage s'ajuste aux mois de la validation croisée sans mieux généraliser ; pour ARIMA, l'ordre (7, 1, 1) retenu par l'AIC réduit l'erreur de mai 2025 sans atteindre celle de Random Forest. Les hyperparamètres par défaut sont conservés en production ; le réglage reste disponible dans l'application et pourra être réactivé lorsque l'historique sera plus long.</w:t>
-      </w:r>
-    </w:p>
-    <w:p>
-      <w:pPr>
-        <w:spacing w:after="40" w:before="40"/>
-      </w:pPr>
-      <w:r>
-        <w:t xml:space="preserve"/>
-      </w:r>
-    </w:p>
-    <w:p>
-      <w:pPr>
-        <w:pStyle w:val="Heading2"/>
-        <w:spacing w:after="90" w:before="200"/>
-        <w:outlineLvl w:val="1"/>
-      </w:pPr>
-      <w:r>
-        <w:rPr>
-          <w:rFonts w:ascii="Times New Roman" w:cs="Times New Roman" w:eastAsia="Times New Roman" w:hAnsi="Times New Roman"/>
-          <w:b/>
-          <w:bCs/>
-          <w:color w:val="000000"/>
-          <w:sz w:val="28"/>
-          <w:szCs w:val="28"/>
-        </w:rPr>
-        <w:t xml:space="preserve">5.7 Résultats comparatifs et sélection du modèle</w:t>
-      </w:r>
-    </w:p>
-    <w:p>
-      <w:pPr>
-        <w:spacing w:after="60" w:before="60" w:line="360" w:lineRule="auto"/>
-        <w:jc w:val="both"/>
-      </w:pPr>
-      <w:r>
-        <w:rPr>
-          <w:rFonts w:ascii="Times New Roman" w:cs="Times New Roman" w:eastAsia="Times New Roman" w:hAnsi="Times New Roman"/>
-          <w:b w:val="false"/>
-          <w:bCs w:val="false"/>
-          <w:i w:val="false"/>
-          <w:iCs w:val="false"/>
-          <w:color w:val="1A1A1A"/>
-          <w:sz w:val="24"/>
-          <w:szCs w:val="24"/>
-        </w:rPr>
-        <w:t xml:space="preserve">Les quatre modèles ont été évalués avec leurs hyperparamètres par défaut. Le tableau 5.9 présente les erreurs de la validation croisée (12 plis de 30 jours) et l'erreur moyenne sur le même mois de l'année précédente (mai 2025), critère de sélection pour la prévision de mai 2026 :</w:t>
-      </w:r>
-    </w:p>
-    <w:p>
-      <w:pPr>
-        <w:spacing w:after="40" w:before="40"/>
-      </w:pPr>
-      <w:r>
-        <w:t xml:space="preserve"/>
-      </w:r>
-    </w:p>
-    <w:tbl>
-      <w:tblPr>
-        <w:tblW w:type="pct" w:w="100%"/>
-        <w:jc w:val="center"/>
-        <w:tblBorders>
-          <w:top w:val="single" w:color="auto" w:sz="4"/>
-          <w:left w:val="single" w:color="auto" w:sz="4"/>
-          <w:bottom w:val="single" w:color="auto" w:sz="4"/>
-          <w:right w:val="single" w:color="auto" w:sz="4"/>
-          <w:insideH w:val="single" w:color="auto" w:sz="4"/>
-          <w:insideV w:val="single" w:color="auto" w:sz="4"/>
-        </w:tblBorders>
-      </w:tblPr>
-      <w:tblGrid>
-        <w:gridCol w:w="1800"/>
-        <w:gridCol w:w="1300"/>
-        <w:gridCol w:w="1300"/>
-        <w:gridCol w:w="1000"/>
-        <w:gridCol w:w="1066"/>
-      </w:tblGrid>
-      <w:tr>
-        <w:trPr>
-          <w:tblHeader/>
-        </w:trPr>
-        <w:tc>
-          <w:tcPr>
-            <w:tcW w:type="dxa" w:w="1800"/>
-            <w:tcBorders>
-              <w:top w:val="single" w:color="AAAAAA" w:sz="1"/>
-              <w:left w:val="single" w:color="AAAAAA" w:sz="1"/>
-              <w:bottom w:val="single" w:color="AAAAAA" w:sz="1"/>
-              <w:right w:val="single" w:color="AAAAAA" w:sz="1"/>
-            </w:tcBorders>
-            <w:shd w:fill="333333" w:val="clear"/>
-            <w:tcMar>
-              <w:top w:type="dxa" w:w="50"/>
-              <w:left w:type="dxa" w:w="80"/>
-              <w:bottom w:type="dxa" w:w="50"/>
-              <w:right w:type="dxa" w:w="80"/>
-            </w:tcMar>
-            <w:vAlign w:val="center"/>
-          </w:tcPr>
-          <w:p>
-            <w:pPr>
-              <w:spacing w:after="20" w:before="20"/>
-              <w:jc w:val="center"/>
-            </w:pPr>
-            <w:r>
-              <w:rPr>
-                <w:rFonts w:ascii="Arial" w:cs="Arial" w:eastAsia="Arial" w:hAnsi="Arial"/>
-                <w:b/>
-                <w:bCs/>
-                <w:color w:val="FFFFFF"/>
-                <w:sz w:val="19"/>
-                <w:szCs w:val="19"/>
-              </w:rPr>
-              <w:t xml:space="preserve">Modèle</w:t>
-            </w:r>
-          </w:p>
-        </w:tc>
-        <w:tc>
-          <w:tcPr>
-            <w:tcW w:type="dxa" w:w="1300"/>
-            <w:tcBorders>
-              <w:top w:val="single" w:color="AAAAAA" w:sz="1"/>
-              <w:left w:val="single" w:color="AAAAAA" w:sz="1"/>
-              <w:bottom w:val="single" w:color="AAAAAA" w:sz="1"/>
-              <w:right w:val="single" w:color="AAAAAA" w:sz="1"/>
-            </w:tcBorders>
-            <w:shd w:fill="333333" w:val="clear"/>
-            <w:tcMar>
-              <w:top w:type="dxa" w:w="50"/>
-              <w:left w:type="dxa" w:w="80"/>
-              <w:bottom w:type="dxa" w:w="50"/>
-              <w:right w:type="dxa" w:w="80"/>
-            </w:tcMar>
-            <w:vAlign w:val="center"/>
-          </w:tcPr>
-          <w:p>
-            <w:pPr>
-              <w:spacing w:after="20" w:before="20"/>
-              <w:jc w:val="center"/>
-            </w:pPr>
-            <w:r>
-              <w:rPr>
-                <w:rFonts w:ascii="Arial" w:cs="Arial" w:eastAsia="Arial" w:hAnsi="Arial"/>
-                <w:b/>
-                <w:bCs/>
-                <w:color w:val="FFFFFF"/>
-                <w:sz w:val="19"/>
-                <w:szCs w:val="19"/>
-              </w:rPr>
-              <w:t xml:space="preserve">MAE CV (u/j)</w:t>
-            </w:r>
-          </w:p>
-        </w:tc>
-        <w:tc>
-          <w:tcPr>
-            <w:tcW w:type="dxa" w:w="1300"/>
-            <w:tcBorders>
-              <w:top w:val="single" w:color="AAAAAA" w:sz="1"/>
-              <w:left w:val="single" w:color="AAAAAA" w:sz="1"/>
-              <w:bottom w:val="single" w:color="AAAAAA" w:sz="1"/>
-              <w:right w:val="single" w:color="AAAAAA" w:sz="1"/>
-            </w:tcBorders>
-            <w:shd w:fill="333333" w:val="clear"/>
-            <w:tcMar>
-              <w:top w:type="dxa" w:w="50"/>
-              <w:left w:type="dxa" w:w="80"/>
-              <w:bottom w:type="dxa" w:w="50"/>
-              <w:right w:type="dxa" w:w="80"/>
-            </w:tcMar>
-            <w:vAlign w:val="center"/>
-          </w:tcPr>
-          <w:p>
-            <w:pPr>
-              <w:spacing w:after="20" w:before="20"/>
-              <w:jc w:val="center"/>
-            </w:pPr>
-            <w:r>
-              <w:rPr>
-                <w:rFonts w:ascii="Arial" w:cs="Arial" w:eastAsia="Arial" w:hAnsi="Arial"/>
-                <w:b/>
-                <w:bCs/>
-                <w:color w:val="FFFFFF"/>
-                <w:sz w:val="19"/>
-                <w:szCs w:val="19"/>
-              </w:rPr>
-              <w:t xml:space="preserve">RMSE CV (u/j)</w:t>
-            </w:r>
-          </w:p>
-        </w:tc>
-        <w:tc>
-          <w:tcPr>
-            <w:tcW w:type="dxa" w:w="1000"/>
-            <w:tcBorders>
-              <w:top w:val="single" w:color="AAAAAA" w:sz="1"/>
-              <w:left w:val="single" w:color="AAAAAA" w:sz="1"/>
-              <w:bottom w:val="single" w:color="AAAAAA" w:sz="1"/>
-              <w:right w:val="single" w:color="AAAAAA" w:sz="1"/>
-            </w:tcBorders>
-            <w:shd w:fill="333333" w:val="clear"/>
-            <w:tcMar>
-              <w:top w:type="dxa" w:w="50"/>
-              <w:left w:type="dxa" w:w="80"/>
-              <w:bottom w:type="dxa" w:w="50"/>
-              <w:right w:type="dxa" w:w="80"/>
-            </w:tcMar>
-            <w:vAlign w:val="center"/>
-          </w:tcPr>
-          <w:p>
-            <w:pPr>
-              <w:spacing w:after="20" w:before="20"/>
-              <w:jc w:val="center"/>
-            </w:pPr>
-            <w:r>
-              <w:rPr>
-                <w:rFonts w:ascii="Arial" w:cs="Arial" w:eastAsia="Arial" w:hAnsi="Arial"/>
-                <w:b/>
-                <w:bCs/>
-                <w:color w:val="FFFFFF"/>
-                <w:sz w:val="19"/>
-                <w:szCs w:val="19"/>
-              </w:rPr>
-              <w:t xml:space="preserve">R² (CV)</w:t>
-            </w:r>
-          </w:p>
-        </w:tc>
-        <w:tc>
-          <w:tcPr>
-            <w:tcW w:type="dxa" w:w="1066"/>
-            <w:tcBorders>
-              <w:top w:val="single" w:color="AAAAAA" w:sz="1"/>
-              <w:left w:val="single" w:color="AAAAAA" w:sz="1"/>
-              <w:bottom w:val="single" w:color="AAAAAA" w:sz="1"/>
-              <w:right w:val="single" w:color="AAAAAA" w:sz="1"/>
-            </w:tcBorders>
-            <w:shd w:fill="333333" w:val="clear"/>
-            <w:tcMar>
-              <w:top w:type="dxa" w:w="50"/>
-              <w:left w:type="dxa" w:w="80"/>
-              <w:bottom w:type="dxa" w:w="50"/>
-              <w:right w:type="dxa" w:w="80"/>
-            </w:tcMar>
-            <w:vAlign w:val="center"/>
-          </w:tcPr>
-          <w:p>
-            <w:pPr>
-              <w:spacing w:after="20" w:before="20"/>
-              <w:jc w:val="center"/>
-            </w:pPr>
-            <w:r>
-              <w:rPr>
-                <w:rFonts w:ascii="Arial" w:cs="Arial" w:eastAsia="Arial" w:hAnsi="Arial"/>
-                <w:b/>
-                <w:bCs/>
-                <w:color w:val="FFFFFF"/>
-                <w:sz w:val="19"/>
-                <w:szCs w:val="19"/>
-              </w:rPr>
-              <w:t xml:space="preserve">MAE mai 2025 (u/j)</w:t>
-            </w:r>
-          </w:p>
-        </w:tc>
-      </w:tr>
-      <w:tr>
-        <w:tc>
-          <w:tcPr>
-            <w:tcW w:type="dxa" w:w="1800"/>
-            <w:tcBorders>
-              <w:top w:val="single" w:color="AAAAAA" w:sz="1"/>
-              <w:left w:val="single" w:color="AAAAAA" w:sz="1"/>
-              <w:bottom w:val="single" w:color="AAAAAA" w:sz="1"/>
-              <w:right w:val="single" w:color="AAAAAA" w:sz="1"/>
-            </w:tcBorders>
-            <w:shd w:fill="F9FBFD" w:val="clear"/>
-            <w:tcMar>
-              <w:top w:type="dxa" w:w="40"/>
-              <w:left w:type="dxa" w:w="80"/>
-              <w:bottom w:type="dxa" w:w="40"/>
-              <w:right w:type="dxa" w:w="80"/>
-            </w:tcMar>
-          </w:tcPr>
-          <w:p>
-            <w:pPr>
-              <w:spacing w:after="20" w:before="20" w:line="240" w:lineRule="auto"/>
-              <w:jc w:val="left"/>
-            </w:pPr>
-            <w:r>
-              <w:rPr>
-                <w:rFonts w:ascii="Arial" w:cs="Arial" w:eastAsia="Arial" w:hAnsi="Arial"/>
-                <w:b w:val="false"/>
-                <w:bCs w:val="false"/>
-                <w:i w:val="false"/>
-                <w:iCs w:val="false"/>
-                <w:sz w:val="18"/>
-                <w:szCs w:val="18"/>
-              </w:rPr>
-              <w:t xml:space="preserve">Random Forest (retenu)</w:t>
-            </w:r>
-          </w:p>
-        </w:tc>
-        <w:tc>
-          <w:tcPr>
-            <w:tcW w:type="dxa" w:w="1300"/>
-            <w:tcBorders>
-              <w:top w:val="single" w:color="AAAAAA" w:sz="1"/>
-              <w:left w:val="single" w:color="AAAAAA" w:sz="1"/>
-              <w:bottom w:val="single" w:color="AAAAAA" w:sz="1"/>
-              <w:right w:val="single" w:color="AAAAAA" w:sz="1"/>
-            </w:tcBorders>
-            <w:shd w:fill="F9FBFD" w:val="clear"/>
-            <w:tcMar>
-              <w:top w:type="dxa" w:w="40"/>
-              <w:left w:type="dxa" w:w="80"/>
-              <w:bottom w:type="dxa" w:w="40"/>
-              <w:right w:type="dxa" w:w="80"/>
-            </w:tcMar>
-          </w:tcPr>
-          <w:p>
-            <w:pPr>
-              <w:spacing w:after="20" w:before="20" w:line="240" w:lineRule="auto"/>
-              <w:jc w:val="center"/>
-            </w:pPr>
-            <w:r>
-              <w:rPr>
-                <w:rFonts w:ascii="Arial" w:cs="Arial" w:eastAsia="Arial" w:hAnsi="Arial"/>
-                <w:b w:val="false"/>
-                <w:bCs w:val="false"/>
-                <w:i w:val="false"/>
-                <w:iCs w:val="false"/>
-                <w:sz w:val="18"/>
-                <w:szCs w:val="18"/>
-              </w:rPr>
-              <w:t xml:space="preserve">69 532</w:t>
-            </w:r>
-          </w:p>
-        </w:tc>
-        <w:tc>
-          <w:tcPr>
-            <w:tcW w:type="dxa" w:w="1300"/>
-            <w:tcBorders>
-              <w:top w:val="single" w:color="AAAAAA" w:sz="1"/>
-              <w:left w:val="single" w:color="AAAAAA" w:sz="1"/>
-              <w:bottom w:val="single" w:color="AAAAAA" w:sz="1"/>
-              <w:right w:val="single" w:color="AAAAAA" w:sz="1"/>
-            </w:tcBorders>
-            <w:shd w:fill="F9FBFD" w:val="clear"/>
-            <w:tcMar>
-              <w:top w:type="dxa" w:w="40"/>
-              <w:left w:type="dxa" w:w="80"/>
-              <w:bottom w:type="dxa" w:w="40"/>
-              <w:right w:type="dxa" w:w="80"/>
-            </w:tcMar>
-          </w:tcPr>
-          <w:p>
-            <w:pPr>
-              <w:spacing w:after="20" w:before="20" w:line="240" w:lineRule="auto"/>
-              <w:jc w:val="center"/>
-            </w:pPr>
-            <w:r>
-              <w:rPr>
-                <w:rFonts w:ascii="Arial" w:cs="Arial" w:eastAsia="Arial" w:hAnsi="Arial"/>
-                <w:b w:val="false"/>
-                <w:bCs w:val="false"/>
-                <w:i w:val="false"/>
-                <w:iCs w:val="false"/>
-                <w:sz w:val="18"/>
-                <w:szCs w:val="18"/>
-              </w:rPr>
-              <w:t xml:space="preserve">173 423</w:t>
-            </w:r>
-          </w:p>
-        </w:tc>
-        <w:tc>
-          <w:tcPr>
-            <w:tcW w:type="dxa" w:w="1000"/>
-            <w:tcBorders>
-              <w:top w:val="single" w:color="AAAAAA" w:sz="1"/>
-              <w:left w:val="single" w:color="AAAAAA" w:sz="1"/>
-              <w:bottom w:val="single" w:color="AAAAAA" w:sz="1"/>
-              <w:right w:val="single" w:color="AAAAAA" w:sz="1"/>
-            </w:tcBorders>
-            <w:shd w:fill="F9FBFD" w:val="clear"/>
-            <w:tcMar>
-              <w:top w:type="dxa" w:w="40"/>
-              <w:left w:type="dxa" w:w="80"/>
-              <w:bottom w:type="dxa" w:w="40"/>
-              <w:right w:type="dxa" w:w="80"/>
-            </w:tcMar>
-          </w:tcPr>
-          <w:p>
-            <w:pPr>
-              <w:spacing w:after="20" w:before="20" w:line="240" w:lineRule="auto"/>
-              <w:jc w:val="center"/>
-            </w:pPr>
-            <w:r>
-              <w:rPr>
-                <w:rFonts w:ascii="Arial" w:cs="Arial" w:eastAsia="Arial" w:hAnsi="Arial"/>
-                <w:b w:val="false"/>
-                <w:bCs w:val="false"/>
-                <w:i w:val="false"/>
-                <w:iCs w:val="false"/>
-                <w:sz w:val="18"/>
-                <w:szCs w:val="18"/>
-              </w:rPr>
-              <w:t xml:space="preserve">0,136</w:t>
-            </w:r>
-          </w:p>
-        </w:tc>
-        <w:tc>
-          <w:tcPr>
-            <w:tcW w:type="dxa" w:w="1066"/>
-            <w:tcBorders>
-              <w:top w:val="single" w:color="AAAAAA" w:sz="1"/>
-              <w:left w:val="single" w:color="AAAAAA" w:sz="1"/>
-              <w:bottom w:val="single" w:color="AAAAAA" w:sz="1"/>
-              <w:right w:val="single" w:color="AAAAAA" w:sz="1"/>
-            </w:tcBorders>
-            <w:shd w:fill="F9FBFD" w:val="clear"/>
-            <w:tcMar>
-              <w:top w:type="dxa" w:w="40"/>
-              <w:left w:type="dxa" w:w="80"/>
-              <w:bottom w:type="dxa" w:w="40"/>
-              <w:right w:type="dxa" w:w="80"/>
-            </w:tcMar>
-          </w:tcPr>
-          <w:p>
-            <w:pPr>
-              <w:spacing w:after="20" w:before="20" w:line="240" w:lineRule="auto"/>
-              <w:jc w:val="center"/>
-            </w:pPr>
-            <w:r>
-              <w:rPr>
-                <w:rFonts w:ascii="Arial" w:cs="Arial" w:eastAsia="Arial" w:hAnsi="Arial"/>
-                <w:b w:val="false"/>
-                <w:bCs w:val="false"/>
-                <w:i w:val="false"/>
-                <w:iCs w:val="false"/>
-                <w:sz w:val="18"/>
-                <w:szCs w:val="18"/>
-              </w:rPr>
-              <w:t xml:space="preserve">33 614</w:t>
-            </w:r>
-          </w:p>
-        </w:tc>
-      </w:tr>
-      <w:tr>
-        <w:tc>
-          <w:tcPr>
-            <w:tcW w:type="dxa" w:w="1800"/>
-            <w:tcBorders>
-              <w:top w:val="single" w:color="AAAAAA" w:sz="1"/>
-              <w:left w:val="single" w:color="AAAAAA" w:sz="1"/>
-              <w:bottom w:val="single" w:color="AAAAAA" w:sz="1"/>
-              <w:right w:val="single" w:color="AAAAAA" w:sz="1"/>
-            </w:tcBorders>
-            <w:shd w:fill="FFFFFF" w:val="clear"/>
-            <w:tcMar>
-              <w:top w:type="dxa" w:w="40"/>
-              <w:left w:type="dxa" w:w="80"/>
-              <w:bottom w:type="dxa" w:w="40"/>
-              <w:right w:type="dxa" w:w="80"/>
-            </w:tcMar>
-          </w:tcPr>
-          <w:p>
-            <w:pPr>
-              <w:spacing w:after="20" w:before="20" w:line="240" w:lineRule="auto"/>
-              <w:jc w:val="left"/>
-            </w:pPr>
-            <w:r>
-              <w:rPr>
-                <w:rFonts w:ascii="Arial" w:cs="Arial" w:eastAsia="Arial" w:hAnsi="Arial"/>
-                <w:b w:val="false"/>
-                <w:bCs w:val="false"/>
-                <w:i w:val="false"/>
-                <w:iCs w:val="false"/>
-                <w:sz w:val="18"/>
-                <w:szCs w:val="18"/>
-              </w:rPr>
-              <w:t xml:space="preserve">ARIMA</w:t>
-            </w:r>
-          </w:p>
-        </w:tc>
-        <w:tc>
-          <w:tcPr>
-            <w:tcW w:type="dxa" w:w="1300"/>
-            <w:tcBorders>
-              <w:top w:val="single" w:color="AAAAAA" w:sz="1"/>
-              <w:left w:val="single" w:color="AAAAAA" w:sz="1"/>
-              <w:bottom w:val="single" w:color="AAAAAA" w:sz="1"/>
-              <w:right w:val="single" w:color="AAAAAA" w:sz="1"/>
-            </w:tcBorders>
-            <w:shd w:fill="FFFFFF" w:val="clear"/>
-            <w:tcMar>
-              <w:top w:type="dxa" w:w="40"/>
-              <w:left w:type="dxa" w:w="80"/>
-              <w:bottom w:type="dxa" w:w="40"/>
-              <w:right w:type="dxa" w:w="80"/>
-            </w:tcMar>
-          </w:tcPr>
-          <w:p>
-            <w:pPr>
-              <w:spacing w:after="20" w:before="20" w:line="240" w:lineRule="auto"/>
-              <w:jc w:val="center"/>
-            </w:pPr>
-            <w:r>
-              <w:rPr>
-                <w:rFonts w:ascii="Arial" w:cs="Arial" w:eastAsia="Arial" w:hAnsi="Arial"/>
-                <w:b w:val="false"/>
-                <w:bCs w:val="false"/>
-                <w:i w:val="false"/>
-                <w:iCs w:val="false"/>
-                <w:sz w:val="18"/>
-                <w:szCs w:val="18"/>
-              </w:rPr>
-              <w:t xml:space="preserve">85 080</w:t>
-            </w:r>
-          </w:p>
-        </w:tc>
-        <w:tc>
-          <w:tcPr>
-            <w:tcW w:type="dxa" w:w="1300"/>
-            <w:tcBorders>
-              <w:top w:val="single" w:color="AAAAAA" w:sz="1"/>
-              <w:left w:val="single" w:color="AAAAAA" w:sz="1"/>
-              <w:bottom w:val="single" w:color="AAAAAA" w:sz="1"/>
-              <w:right w:val="single" w:color="AAAAAA" w:sz="1"/>
-            </w:tcBorders>
-            <w:shd w:fill="FFFFFF" w:val="clear"/>
-            <w:tcMar>
-              <w:top w:type="dxa" w:w="40"/>
-              <w:left w:type="dxa" w:w="80"/>
-              <w:bottom w:type="dxa" w:w="40"/>
-              <w:right w:type="dxa" w:w="80"/>
-            </w:tcMar>
-          </w:tcPr>
-          <w:p>
-            <w:pPr>
-              <w:spacing w:after="20" w:before="20" w:line="240" w:lineRule="auto"/>
-              <w:jc w:val="center"/>
-            </w:pPr>
-            <w:r>
-              <w:rPr>
-                <w:rFonts w:ascii="Arial" w:cs="Arial" w:eastAsia="Arial" w:hAnsi="Arial"/>
-                <w:b w:val="false"/>
-                <w:bCs w:val="false"/>
-                <w:i w:val="false"/>
-                <w:iCs w:val="false"/>
-                <w:sz w:val="18"/>
-                <w:szCs w:val="18"/>
-              </w:rPr>
-              <w:t xml:space="preserve">183 066</w:t>
-            </w:r>
-          </w:p>
-        </w:tc>
-        <w:tc>
-          <w:tcPr>
-            <w:tcW w:type="dxa" w:w="1000"/>
-            <w:tcBorders>
-              <w:top w:val="single" w:color="AAAAAA" w:sz="1"/>
-              <w:left w:val="single" w:color="AAAAAA" w:sz="1"/>
-              <w:bottom w:val="single" w:color="AAAAAA" w:sz="1"/>
-              <w:right w:val="single" w:color="AAAAAA" w:sz="1"/>
-            </w:tcBorders>
-            <w:shd w:fill="FFFFFF" w:val="clear"/>
-            <w:tcMar>
-              <w:top w:type="dxa" w:w="40"/>
-              <w:left w:type="dxa" w:w="80"/>
-              <w:bottom w:type="dxa" w:w="40"/>
-              <w:right w:type="dxa" w:w="80"/>
-            </w:tcMar>
-          </w:tcPr>
-          <w:p>
-            <w:pPr>
-              <w:spacing w:after="20" w:before="20" w:line="240" w:lineRule="auto"/>
-              <w:jc w:val="center"/>
-            </w:pPr>
-            <w:r>
-              <w:rPr>
-                <w:rFonts w:ascii="Arial" w:cs="Arial" w:eastAsia="Arial" w:hAnsi="Arial"/>
-                <w:b w:val="false"/>
-                <w:bCs w:val="false"/>
-                <w:i w:val="false"/>
-                <w:iCs w:val="false"/>
-                <w:sz w:val="18"/>
-                <w:szCs w:val="18"/>
-              </w:rPr>
-              <w:t xml:space="preserve">0,038</w:t>
-            </w:r>
-          </w:p>
-        </w:tc>
-        <w:tc>
-          <w:tcPr>
-            <w:tcW w:type="dxa" w:w="1066"/>
-            <w:tcBorders>
-              <w:top w:val="single" w:color="AAAAAA" w:sz="1"/>
-              <w:left w:val="single" w:color="AAAAAA" w:sz="1"/>
-              <w:bottom w:val="single" w:color="AAAAAA" w:sz="1"/>
-              <w:right w:val="single" w:color="AAAAAA" w:sz="1"/>
-            </w:tcBorders>
-            <w:shd w:fill="FFFFFF" w:val="clear"/>
-            <w:tcMar>
-              <w:top w:type="dxa" w:w="40"/>
-              <w:left w:type="dxa" w:w="80"/>
-              <w:bottom w:type="dxa" w:w="40"/>
-              <w:right w:type="dxa" w:w="80"/>
-            </w:tcMar>
-          </w:tcPr>
-          <w:p>
-            <w:pPr>
-              <w:spacing w:after="20" w:before="20" w:line="240" w:lineRule="auto"/>
-              <w:jc w:val="center"/>
-            </w:pPr>
-            <w:r>
-              <w:rPr>
-                <w:rFonts w:ascii="Arial" w:cs="Arial" w:eastAsia="Arial" w:hAnsi="Arial"/>
-                <w:b w:val="false"/>
-                <w:bCs w:val="false"/>
-                <w:i w:val="false"/>
-                <w:iCs w:val="false"/>
-                <w:sz w:val="18"/>
-                <w:szCs w:val="18"/>
-              </w:rPr>
-              <w:t xml:space="preserve">60 583</w:t>
-            </w:r>
-          </w:p>
-        </w:tc>
-      </w:tr>
-      <w:tr>
-        <w:tc>
-          <w:tcPr>
-            <w:tcW w:type="dxa" w:w="1800"/>
-            <w:tcBorders>
-              <w:top w:val="single" w:color="AAAAAA" w:sz="1"/>
-              <w:left w:val="single" w:color="AAAAAA" w:sz="1"/>
-              <w:bottom w:val="single" w:color="AAAAAA" w:sz="1"/>
-              <w:right w:val="single" w:color="AAAAAA" w:sz="1"/>
-            </w:tcBorders>
-            <w:shd w:fill="F9FBFD" w:val="clear"/>
-            <w:tcMar>
-              <w:top w:type="dxa" w:w="40"/>
-              <w:left w:type="dxa" w:w="80"/>
-              <w:bottom w:type="dxa" w:w="40"/>
-              <w:right w:type="dxa" w:w="80"/>
-            </w:tcMar>
-          </w:tcPr>
-          <w:p>
-            <w:pPr>
-              <w:spacing w:after="20" w:before="20" w:line="240" w:lineRule="auto"/>
-              <w:jc w:val="left"/>
-            </w:pPr>
-            <w:r>
-              <w:rPr>
-                <w:rFonts w:ascii="Arial" w:cs="Arial" w:eastAsia="Arial" w:hAnsi="Arial"/>
-                <w:b w:val="false"/>
-                <w:bCs w:val="false"/>
-                <w:i w:val="false"/>
-                <w:iCs w:val="false"/>
-                <w:sz w:val="18"/>
-                <w:szCs w:val="18"/>
-              </w:rPr>
-              <w:t xml:space="preserve">Prophet</w:t>
-            </w:r>
-          </w:p>
-        </w:tc>
-        <w:tc>
-          <w:tcPr>
-            <w:tcW w:type="dxa" w:w="1300"/>
-            <w:tcBorders>
-              <w:top w:val="single" w:color="AAAAAA" w:sz="1"/>
-              <w:left w:val="single" w:color="AAAAAA" w:sz="1"/>
-              <w:bottom w:val="single" w:color="AAAAAA" w:sz="1"/>
-              <w:right w:val="single" w:color="AAAAAA" w:sz="1"/>
-            </w:tcBorders>
-            <w:shd w:fill="F9FBFD" w:val="clear"/>
-            <w:tcMar>
-              <w:top w:type="dxa" w:w="40"/>
-              <w:left w:type="dxa" w:w="80"/>
-              <w:bottom w:type="dxa" w:w="40"/>
-              <w:right w:type="dxa" w:w="80"/>
-            </w:tcMar>
-          </w:tcPr>
-          <w:p>
-            <w:pPr>
-              <w:spacing w:after="20" w:before="20" w:line="240" w:lineRule="auto"/>
-              <w:jc w:val="center"/>
-            </w:pPr>
-            <w:r>
-              <w:rPr>
-                <w:rFonts w:ascii="Arial" w:cs="Arial" w:eastAsia="Arial" w:hAnsi="Arial"/>
-                <w:b w:val="false"/>
-                <w:bCs w:val="false"/>
-                <w:i w:val="false"/>
-                <w:iCs w:val="false"/>
-                <w:sz w:val="18"/>
-                <w:szCs w:val="18"/>
-              </w:rPr>
-              <w:t xml:space="preserve">67 927</w:t>
-            </w:r>
-          </w:p>
-        </w:tc>
-        <w:tc>
-          <w:tcPr>
-            <w:tcW w:type="dxa" w:w="1300"/>
-            <w:tcBorders>
-              <w:top w:val="single" w:color="AAAAAA" w:sz="1"/>
-              <w:left w:val="single" w:color="AAAAAA" w:sz="1"/>
-              <w:bottom w:val="single" w:color="AAAAAA" w:sz="1"/>
-              <w:right w:val="single" w:color="AAAAAA" w:sz="1"/>
-            </w:tcBorders>
-            <w:shd w:fill="F9FBFD" w:val="clear"/>
-            <w:tcMar>
-              <w:top w:type="dxa" w:w="40"/>
-              <w:left w:type="dxa" w:w="80"/>
-              <w:bottom w:type="dxa" w:w="40"/>
-              <w:right w:type="dxa" w:w="80"/>
-            </w:tcMar>
-          </w:tcPr>
-          <w:p>
-            <w:pPr>
-              <w:spacing w:after="20" w:before="20" w:line="240" w:lineRule="auto"/>
-              <w:jc w:val="center"/>
-            </w:pPr>
-            <w:r>
-              <w:rPr>
-                <w:rFonts w:ascii="Arial" w:cs="Arial" w:eastAsia="Arial" w:hAnsi="Arial"/>
-                <w:b w:val="false"/>
-                <w:bCs w:val="false"/>
-                <w:i w:val="false"/>
-                <w:iCs w:val="false"/>
-                <w:sz w:val="18"/>
-                <w:szCs w:val="18"/>
-              </w:rPr>
-              <w:t xml:space="preserve">169 147</w:t>
-            </w:r>
-          </w:p>
-        </w:tc>
-        <w:tc>
-          <w:tcPr>
-            <w:tcW w:type="dxa" w:w="1000"/>
-            <w:tcBorders>
-              <w:top w:val="single" w:color="AAAAAA" w:sz="1"/>
-              <w:left w:val="single" w:color="AAAAAA" w:sz="1"/>
-              <w:bottom w:val="single" w:color="AAAAAA" w:sz="1"/>
-              <w:right w:val="single" w:color="AAAAAA" w:sz="1"/>
-            </w:tcBorders>
-            <w:shd w:fill="F9FBFD" w:val="clear"/>
-            <w:tcMar>
-              <w:top w:type="dxa" w:w="40"/>
-              <w:left w:type="dxa" w:w="80"/>
-              <w:bottom w:type="dxa" w:w="40"/>
-              <w:right w:type="dxa" w:w="80"/>
-            </w:tcMar>
-          </w:tcPr>
-          <w:p>
-            <w:pPr>
-              <w:spacing w:after="20" w:before="20" w:line="240" w:lineRule="auto"/>
-              <w:jc w:val="center"/>
-            </w:pPr>
-            <w:r>
-              <w:rPr>
-                <w:rFonts w:ascii="Arial" w:cs="Arial" w:eastAsia="Arial" w:hAnsi="Arial"/>
-                <w:b w:val="false"/>
-                <w:bCs w:val="false"/>
-                <w:i w:val="false"/>
-                <w:iCs w:val="false"/>
-                <w:sz w:val="18"/>
-                <w:szCs w:val="18"/>
-              </w:rPr>
-              <w:t xml:space="preserve">0,178</w:t>
-            </w:r>
-          </w:p>
-        </w:tc>
-        <w:tc>
-          <w:tcPr>
-            <w:tcW w:type="dxa" w:w="1066"/>
-            <w:tcBorders>
-              <w:top w:val="single" w:color="AAAAAA" w:sz="1"/>
-              <w:left w:val="single" w:color="AAAAAA" w:sz="1"/>
-              <w:bottom w:val="single" w:color="AAAAAA" w:sz="1"/>
-              <w:right w:val="single" w:color="AAAAAA" w:sz="1"/>
-            </w:tcBorders>
-            <w:shd w:fill="F9FBFD" w:val="clear"/>
-            <w:tcMar>
-              <w:top w:type="dxa" w:w="40"/>
-              <w:left w:type="dxa" w:w="80"/>
-              <w:bottom w:type="dxa" w:w="40"/>
-              <w:right w:type="dxa" w:w="80"/>
-            </w:tcMar>
-          </w:tcPr>
-          <w:p>
-            <w:pPr>
-              <w:spacing w:after="20" w:before="20" w:line="240" w:lineRule="auto"/>
-              <w:jc w:val="center"/>
-            </w:pPr>
-            <w:r>
-              <w:rPr>
-                <w:rFonts w:ascii="Arial" w:cs="Arial" w:eastAsia="Arial" w:hAnsi="Arial"/>
-                <w:b w:val="false"/>
-                <w:bCs w:val="false"/>
-                <w:i w:val="false"/>
-                <w:iCs w:val="false"/>
-                <w:sz w:val="18"/>
-                <w:szCs w:val="18"/>
-              </w:rPr>
-              <w:t xml:space="preserve">65 937</w:t>
-            </w:r>
-          </w:p>
-        </w:tc>
-      </w:tr>
-      <w:tr>
-        <w:tc>
-          <w:tcPr>
-            <w:tcW w:type="dxa" w:w="1800"/>
-            <w:tcBorders>
-              <w:top w:val="single" w:color="AAAAAA" w:sz="1"/>
-              <w:left w:val="single" w:color="AAAAAA" w:sz="1"/>
-              <w:bottom w:val="single" w:color="AAAAAA" w:sz="1"/>
-              <w:right w:val="single" w:color="AAAAAA" w:sz="1"/>
-            </w:tcBorders>
-            <w:shd w:fill="FFFFFF" w:val="clear"/>
-            <w:tcMar>
-              <w:top w:type="dxa" w:w="40"/>
-              <w:left w:type="dxa" w:w="80"/>
-              <w:bottom w:type="dxa" w:w="40"/>
-              <w:right w:type="dxa" w:w="80"/>
-            </w:tcMar>
-          </w:tcPr>
-          <w:p>
-            <w:pPr>
-              <w:spacing w:after="20" w:before="20" w:line="240" w:lineRule="auto"/>
-              <w:jc w:val="left"/>
-            </w:pPr>
-            <w:r>
-              <w:rPr>
-                <w:rFonts w:ascii="Arial" w:cs="Arial" w:eastAsia="Arial" w:hAnsi="Arial"/>
-                <w:b w:val="false"/>
-                <w:bCs w:val="false"/>
-                <w:i w:val="false"/>
-                <w:iCs w:val="false"/>
-                <w:sz w:val="18"/>
-                <w:szCs w:val="18"/>
-              </w:rPr>
-              <w:t xml:space="preserve">Régression linéaire simple</w:t>
-            </w:r>
-          </w:p>
-        </w:tc>
-        <w:tc>
-          <w:tcPr>
-            <w:tcW w:type="dxa" w:w="1300"/>
-            <w:tcBorders>
-              <w:top w:val="single" w:color="AAAAAA" w:sz="1"/>
-              <w:left w:val="single" w:color="AAAAAA" w:sz="1"/>
-              <w:bottom w:val="single" w:color="AAAAAA" w:sz="1"/>
-              <w:right w:val="single" w:color="AAAAAA" w:sz="1"/>
-            </w:tcBorders>
-            <w:shd w:fill="FFFFFF" w:val="clear"/>
-            <w:tcMar>
-              <w:top w:type="dxa" w:w="40"/>
-              <w:left w:type="dxa" w:w="80"/>
-              <w:bottom w:type="dxa" w:w="40"/>
-              <w:right w:type="dxa" w:w="80"/>
-            </w:tcMar>
-          </w:tcPr>
-          <w:p>
-            <w:pPr>
-              <w:spacing w:after="20" w:before="20" w:line="240" w:lineRule="auto"/>
-              <w:jc w:val="center"/>
-            </w:pPr>
-            <w:r>
-              <w:rPr>
-                <w:rFonts w:ascii="Arial" w:cs="Arial" w:eastAsia="Arial" w:hAnsi="Arial"/>
-                <w:b w:val="false"/>
-                <w:bCs w:val="false"/>
-                <w:i w:val="false"/>
-                <w:iCs w:val="false"/>
-                <w:sz w:val="18"/>
-                <w:szCs w:val="18"/>
-              </w:rPr>
-              <w:t xml:space="preserve">94 635</w:t>
-            </w:r>
-          </w:p>
-        </w:tc>
-        <w:tc>
-          <w:tcPr>
-            <w:tcW w:type="dxa" w:w="1300"/>
-            <w:tcBorders>
-              <w:top w:val="single" w:color="AAAAAA" w:sz="1"/>
-              <w:left w:val="single" w:color="AAAAAA" w:sz="1"/>
-              <w:bottom w:val="single" w:color="AAAAAA" w:sz="1"/>
-              <w:right w:val="single" w:color="AAAAAA" w:sz="1"/>
-            </w:tcBorders>
-            <w:shd w:fill="FFFFFF" w:val="clear"/>
-            <w:tcMar>
-              <w:top w:type="dxa" w:w="40"/>
-              <w:left w:type="dxa" w:w="80"/>
-              <w:bottom w:type="dxa" w:w="40"/>
-              <w:right w:type="dxa" w:w="80"/>
-            </w:tcMar>
-          </w:tcPr>
-          <w:p>
-            <w:pPr>
-              <w:spacing w:after="20" w:before="20" w:line="240" w:lineRule="auto"/>
-              <w:jc w:val="center"/>
-            </w:pPr>
-            <w:r>
-              <w:rPr>
-                <w:rFonts w:ascii="Arial" w:cs="Arial" w:eastAsia="Arial" w:hAnsi="Arial"/>
-                <w:b w:val="false"/>
-                <w:bCs w:val="false"/>
-                <w:i w:val="false"/>
-                <w:iCs w:val="false"/>
-                <w:sz w:val="18"/>
-                <w:szCs w:val="18"/>
-              </w:rPr>
-              <w:t xml:space="preserve">187 422</w:t>
-            </w:r>
-          </w:p>
-        </w:tc>
-        <w:tc>
-          <w:tcPr>
-            <w:tcW w:type="dxa" w:w="1000"/>
-            <w:tcBorders>
-              <w:top w:val="single" w:color="AAAAAA" w:sz="1"/>
-              <w:left w:val="single" w:color="AAAAAA" w:sz="1"/>
-              <w:bottom w:val="single" w:color="AAAAAA" w:sz="1"/>
-              <w:right w:val="single" w:color="AAAAAA" w:sz="1"/>
-            </w:tcBorders>
-            <w:shd w:fill="FFFFFF" w:val="clear"/>
-            <w:tcMar>
-              <w:top w:type="dxa" w:w="40"/>
-              <w:left w:type="dxa" w:w="80"/>
-              <w:bottom w:type="dxa" w:w="40"/>
-              <w:right w:type="dxa" w:w="80"/>
-            </w:tcMar>
-          </w:tcPr>
-          <w:p>
-            <w:pPr>
-              <w:spacing w:after="20" w:before="20" w:line="240" w:lineRule="auto"/>
-              <w:jc w:val="center"/>
-            </w:pPr>
-            <w:r>
-              <w:rPr>
-                <w:rFonts w:ascii="Arial" w:cs="Arial" w:eastAsia="Arial" w:hAnsi="Arial"/>
-                <w:b w:val="false"/>
-                <w:bCs w:val="false"/>
-                <w:i w:val="false"/>
-                <w:iCs w:val="false"/>
-                <w:sz w:val="18"/>
-                <w:szCs w:val="18"/>
-              </w:rPr>
-              <w:t xml:space="preserve">−0,009</w:t>
-            </w:r>
-          </w:p>
-        </w:tc>
-        <w:tc>
-          <w:tcPr>
-            <w:tcW w:type="dxa" w:w="1066"/>
-            <w:tcBorders>
-              <w:top w:val="single" w:color="AAAAAA" w:sz="1"/>
-              <w:left w:val="single" w:color="AAAAAA" w:sz="1"/>
-              <w:bottom w:val="single" w:color="AAAAAA" w:sz="1"/>
-              <w:right w:val="single" w:color="AAAAAA" w:sz="1"/>
-            </w:tcBorders>
-            <w:shd w:fill="FFFFFF" w:val="clear"/>
-            <w:tcMar>
-              <w:top w:type="dxa" w:w="40"/>
-              <w:left w:type="dxa" w:w="80"/>
-              <w:bottom w:type="dxa" w:w="40"/>
-              <w:right w:type="dxa" w:w="80"/>
-            </w:tcMar>
-          </w:tcPr>
-          <w:p>
-            <w:pPr>
-              <w:spacing w:after="20" w:before="20" w:line="240" w:lineRule="auto"/>
-              <w:jc w:val="center"/>
-            </w:pPr>
-            <w:r>
-              <w:rPr>
-                <w:rFonts w:ascii="Arial" w:cs="Arial" w:eastAsia="Arial" w:hAnsi="Arial"/>
-                <w:b w:val="false"/>
-                <w:bCs w:val="false"/>
-                <w:i w:val="false"/>
-                <w:iCs w:val="false"/>
-                <w:sz w:val="18"/>
-                <w:szCs w:val="18"/>
-              </w:rPr>
-              <w:t xml:space="preserve">79 908</w:t>
-            </w:r>
-          </w:p>
-        </w:tc>
-      </w:tr>
-    </w:tbl>
-    <w:p>
-      <w:pPr>
-        <w:spacing w:after="120" w:before="80"/>
-        <w:jc w:val="center"/>
-      </w:pPr>
-      <w:r>
-        <w:rPr>
-          <w:rFonts w:ascii="Times New Roman" w:cs="Times New Roman" w:eastAsia="Times New Roman" w:hAnsi="Times New Roman"/>
-          <w:i/>
-          <w:iCs/>
-          <w:color w:val="595959"/>
-          <w:sz w:val="20"/>
-          <w:szCs w:val="20"/>
-        </w:rPr>
-        <w:t xml:space="preserve">Tableau 5.9 : Performances des modèles (validation croisée et mai 2025)</w:t>
-      </w:r>
-    </w:p>
-    <w:p>
-      <w:pPr>
-        <w:spacing w:after="40" w:before="40"/>
-      </w:pPr>
-      <w:r>
-        <w:t xml:space="preserve"/>
-      </w:r>
-    </w:p>
-    <w:p>
-      <w:pPr>
-        <w:spacing w:after="60" w:before="60" w:line="360" w:lineRule="auto"/>
-        <w:jc w:val="both"/>
-      </w:pPr>
-      <w:r>
-        <w:rPr>
-          <w:rFonts w:ascii="Times New Roman" w:cs="Times New Roman" w:eastAsia="Times New Roman" w:hAnsi="Times New Roman"/>
-          <w:b w:val="false"/>
-          <w:bCs w:val="false"/>
-          <w:i w:val="false"/>
-          <w:iCs w:val="false"/>
-          <w:color w:val="1A1A1A"/>
-          <w:sz w:val="24"/>
-          <w:szCs w:val="24"/>
-        </w:rPr>
-        <w:t xml:space="preserve">En validation croisée, Prophet et Random Forest sont les plus précis (erreur moyenne de 67 927 et 69 532 unités par jour) ; ARIMA (85 080) et la régression linéaire simple (94 635), plus simples, sont moins précis. Le R² faible s'explique par quelques journées extrêmes qui dominent la variance. Sur mai 2025, Random Forest se détache nettement (33 614 unités par jour contre 60 583 pour ARIMA, 65 937 pour Prophet et 79 908 pour la régression linéaire simple) : il est retenu pour la prévision de mai 2026.</w:t>
-      </w:r>
-    </w:p>
-    <w:p>
-      <w:pPr>
-        <w:spacing w:after="60" w:before="60" w:line="360" w:lineRule="auto"/>
-        <w:jc w:val="both"/>
-      </w:pPr>
-      <w:r>
-        <w:rPr>
-          <w:rFonts w:ascii="Times New Roman" w:cs="Times New Roman" w:eastAsia="Times New Roman" w:hAnsi="Times New Roman"/>
-          <w:b w:val="false"/>
-          <w:bCs w:val="false"/>
-          <w:i w:val="false"/>
-          <w:iCs w:val="false"/>
-          <w:color w:val="1A1A1A"/>
-          <w:sz w:val="24"/>
-          <w:szCs w:val="24"/>
-        </w:rPr>
-        <w:t xml:space="preserve">Le meilleur modèle change selon le mois. Appliquée à chacun des douze mois de 2026 (erreur mesurée sur le même mois de 2025), la règle de sélection retient Random Forest 6 mois (janvier à mai et octobre), Prophet 5 mois (juin, juillet, août, novembre et décembre, marqués par des fermetures ou des baisses d'activité) et la régression linéaire simple 1 mois (septembre). Random Forest reste le modèle le plus régulier.</w:t>
+        <w:t xml:space="preserve">Random Forest et Prophet sont les plus précis et très proches (erreur moyenne de 57 079 et 58 420 unités par jour, soit environ 24 % d'une journée moyenne) ; Random Forest, qui obtient la plus faible erreur, est le modèle utilisé par l'application. ARIMA et la régression linéaire simple, plus simples, sont moins précis. Sur le volume d'un mois, l'écart entre prévision et réalité est d'environ 10 %. Le R² reste modéré (0,45) : il compare le modèle à la moyenne, déjà proche de volumes mensuels assez stables ; l'écart de volume mensuel est l'indicateur le plus utile pour la planification.</w:t>
       </w:r>
     </w:p>
     <w:p>
@@ -43824,7 +42811,7 @@
           <w:sz w:val="24"/>
           <w:szCs w:val="24"/>
         </w:rPr>
-        <w:t xml:space="preserve">La prévision suit le rythme hebdomadaire (creux des dimanches). Sur le mois, la production prévue (7,41 millions d'unités) est proche de la production réelle (7,76 millions), soit un écart de −4,5 % ; l'erreur moyenne journalière est de 40 755 unités et le R² atteint 0,63.</w:t>
+        <w:t xml:space="preserve">La prévision suit le rythme hebdomadaire (creux des dimanches). Sur le mois, la production prévue (7,03 millions d'unités) reste proche de la production réelle (7,76 millions), soit un écart de −9,4 % ; l'erreur moyenne journalière est de 39 336 unités et le R² atteint 0,59.</w:t>
       </w:r>
     </w:p>
     <w:p>
@@ -43869,7 +42856,7 @@
           <w:sz w:val="24"/>
           <w:szCs w:val="24"/>
         </w:rPr>
-        <w:t xml:space="preserve">Les pages Data Science et Benchmark présentent la prévision du meilleur modèle pour le mois choisi (par défaut mai 2026) ou pour les 30 jours qui suivent les dernières données. Chaque jour prévu est comparé à la production réelle du même jour de la semaine de l'année précédente (date − 52 semaines), afin de comparer un lundi à un lundi :</w:t>
+        <w:t xml:space="preserve">Les pages Data Science et Benchmark présentent la prévision de Random Forest pour le mois choisi (par défaut mai 2026) ou pour les 30 jours qui suivent les dernières données. Chaque jour prévu est comparé à la production réelle du même jour de la semaine de l'année précédente (date − 52 semaines), afin de comparer un lundi à un lundi :</w:t>
       </w:r>
     </w:p>
     <w:p>
@@ -43907,7 +42894,7 @@
           <w:sz w:val="24"/>
           <w:szCs w:val="24"/>
         </w:rPr>
-        <w:t xml:space="preserve">La figure 5.2 superpose la prévision de mai 2026 (Random Forest) et la production de mai 2025. La prévision totale s'élève à 7 595 764 unités, contre 8 150 549 unités produites sur les mêmes jours de semaine de mai 2025 (−6,8 %).</w:t>
+        <w:t xml:space="preserve">La figure 5.2 superpose la prévision de mai 2026 (Random Forest) et la production de mai 2025. La prévision totale s'élève à 7 406 853 unités, contre 8 150 549 unités produites sur les mêmes jours de semaine de mai 2025 (−9,1 %).</w:t>
       </w:r>
     </w:p>
     <w:p>
@@ -43997,7 +42984,7 @@
           <w:sz w:val="24"/>
           <w:szCs w:val="24"/>
         </w:rPr>
-        <w:t xml:space="preserve">Pour un mois déjà écoulé, la prévision est calculée avec les seules données antérieures au mois puis comparée à la production réelle (figure 5.1). L'utilisateur peut aussi importer un fichier Excel (date, quantité) depuis la page Benchmark : les quatre modèles sont alors évalués sur ces données selon le même protocole.</w:t>
+        <w:t xml:space="preserve">Pour un mois déjà écoulé, la prévision est calculée avec les seules données antérieures au mois puis comparée à la production réelle (figure 5.1). L'utilisateur peut aussi importer un fichier Excel (date, quantité) depuis la page Benchmark : le modèle est alors évalué sur ces données selon le même protocole.</w:t>
       </w:r>
     </w:p>
     <w:p>
@@ -44024,7 +43011,7 @@
           <w:sz w:val="24"/>
           <w:szCs w:val="24"/>
         </w:rPr>
-        <w:t xml:space="preserve">Le calcul complet (validation croisée, validation N-1 et prévision) prend une à deux minutes ; le résultat est conservé en cache pendant une heure. Si un modèle ne peut pas être entraîné, il est écarté de la comparaison sans bloquer les autres.</w:t>
+        <w:t xml:space="preserve">Le calcul complet (validation croisée et prévision) prend une vingtaine de secondes ; le résultat est conservé en cache pendant une heure. La page Benchmark relance l'entraînement à chaque ouverture et affiche ses étapes en direct.</w:t>
       </w:r>
     </w:p>
     <w:p>
@@ -44069,7 +43056,7 @@
           <w:sz w:val="24"/>
           <w:szCs w:val="24"/>
         </w:rPr>
-        <w:t xml:space="preserve">La forte variabilité de la production journalière (coefficient de variation de 65 %, journées extrêmes, 43 jours sans production) limite la précision atteignable sur un mois. Le protocole en tient compte : plafonnement des valeurs extrêmes, fermetures apprises automatiquement, choix du modèle propre à chaque période et comparaison systématique avec l'année précédente. Le classement des modèles peut changer d'une période à l'autre ; c'est pourquoi la sélection est recalculée pour chaque prévision au lieu d'être fixée une fois pour toutes.</w:t>
+        <w:t xml:space="preserve">La forte variabilité de la production journalière (coefficient de variation de 65 %, journées extrêmes, jours sans production) limite la précision au jour près ; les mois de fermeture (août, fin d'année) restent les plus difficiles. Le protocole en tient compte : six ans d'historique, plafonnement des valeurs extrêmes, fermetures apprises automatiquement et suivi de l'écart de volume mensuel.</w:t>
       </w:r>
     </w:p>
     <w:p>
@@ -44114,7 +43101,7 @@
           <w:sz w:val="24"/>
           <w:szCs w:val="24"/>
         </w:rPr>
-        <w:t xml:space="preserve">Les quatre modèles sont conservés et réévalués à chaque prévision. Random Forest est le plus régulier : il est retenu pour mai 2026 et obtient la plus faible erreur moyenne sur les douze mois de 2025 comme sur les données réelles de début 2026. Prophet obtient la meilleure erreur en validation croisée et l'emporte sur les mois marqués par des fermetures. La régression linéaire simple et ARIMA servent de modèles de référence ; seule la régression linéaire simple l'emporte ponctuellement (septembre). Ce fonctionnement évite de figer un modèle « champion » dont la supériorité ne serait pas stable dans le temps.</w:t>
+        <w:t xml:space="preserve">Random Forest est le modèle utilisé par l'application : il obtient la plus faible erreur moyenne en validation croisée. Prophet, très proche, reste une bonne alternative, notamment pour les mois de fermeture. ARIMA et la régression linéaire simple servent de modèles de référence. Les quatre modèles restent disponibles dans le service de prévision, ce qui permet de refaire la comparaison lorsque de nouvelles données sont disponibles.</w:t>
       </w:r>
     </w:p>
     <w:p>
@@ -44159,7 +43146,7 @@
           <w:sz w:val="24"/>
           <w:szCs w:val="24"/>
         </w:rPr>
-        <w:t xml:space="preserve">Le tableau 5.10 récapitule les livrables réalisés au terme du Sprint 3 :</w:t>
+        <w:t xml:space="preserve">Le tableau 5.9 récapitule les livrables réalisés au terme du Sprint 3 :</w:t>
       </w:r>
     </w:p>
     <w:p>
@@ -44370,7 +43357,7 @@
                 <w:sz w:val="18"/>
                 <w:szCs w:val="18"/>
               </w:rPr>
-              <w:t xml:space="preserve">Série journalière TRS, plafonnement des valeurs extrêmes et calendrier industriel</w:t>
+              <w:t xml:space="preserve">Série journalière TRS depuis 2020, plafonnement des valeurs extrêmes et calendrier industriel</w:t>
             </w:r>
           </w:p>
         </w:tc>
@@ -44590,7 +43577,7 @@
                 <w:sz w:val="18"/>
                 <w:szCs w:val="18"/>
               </w:rPr>
-              <w:t xml:space="preserve">Origine glissante, 12 plis de 30 jours (MAE, RMSE, R²)</w:t>
+              <w:t xml:space="preserve">Origine glissante, 12 plis de 31 jours (MAE, RMSE, R², MAPE, écart de volume)</w:t>
             </w:r>
           </w:p>
         </w:tc>
@@ -44700,7 +43687,7 @@
                 <w:sz w:val="18"/>
                 <w:szCs w:val="18"/>
               </w:rPr>
-              <w:t xml:space="preserve">Recherche sur grille (6 plis / AIC) et contrôle sur l'année N-1</w:t>
+              <w:t xml:space="preserve">Recherche sur grille disponible en option (AIC pour ARIMA)</w:t>
             </w:r>
           </w:p>
         </w:tc>
@@ -44810,7 +43797,7 @@
                 <w:sz w:val="18"/>
                 <w:szCs w:val="18"/>
               </w:rPr>
-              <w:t xml:space="preserve">Plus faible MAE sur le même mois de l'année N-1</w:t>
+              <w:t xml:space="preserve">Plus faible MAE en validation croisée : Random Forest</w:t>
             </w:r>
           </w:p>
         </w:tc>
@@ -44976,7 +43963,7 @@
           <w:sz w:val="20"/>
           <w:szCs w:val="20"/>
         </w:rPr>
-        <w:t xml:space="preserve">Tableau 5.10 : Bilan des livrables du Sprint 3</w:t>
+        <w:t xml:space="preserve">Tableau 5.9 : Bilan des livrables du Sprint 3</w:t>
       </w:r>
     </w:p>
     <w:p>
@@ -45021,7 +44008,7 @@
           <w:sz w:val="24"/>
           <w:szCs w:val="24"/>
         </w:rPr>
-        <w:t xml:space="preserve">Ce chapitre a présenté le développement et l'évaluation de quatre modèles de prévision selon un protocole adapté aux séries temporelles : validation croisée à origine glissante (12 plis de 30 jours), réglage des hyperparamètres et sélection du modèle sur le même mois de l'année précédente, avec la MAE comme critère. Aucun modèle n'est le meilleur pour tous les mois : Random Forest est retenu pour mai 2026 et se montre le plus régulier, Prophet est le plus performant sur les mois de fermeture. Contrôlée sur février 2026, la prévision s'écarte de −4,5 % de la production réelle. Le chapitre suivant aborde le Sprint 4, consacré au portail web, au rapport Power BI et à la recette fonctionnelle.</w:t>
+        <w:t xml:space="preserve">Ce chapitre a présenté le développement et l'évaluation de quatre modèles de prévision selon un protocole adapté aux séries temporelles : six ans d'historique, validation croisée à origine glissante (12 plis de 31 jours) et cinq indicateurs (MAE, RMSE, R², MAPE et écart de volume mensuel). Random Forest obtient la plus faible erreur (57 079 unités par jour) et prévoit le volume d'un mois à environ 10 % près ; il est le modèle utilisé par l'application. Contrôlée sur février 2026, la prévision s'écarte de −9,4 % de la production réelle. Le chapitre suivant aborde le Sprint 4, consacré au portail web et au rapport Power BI.</w:t>
       </w:r>
     </w:p>
     <w:p>
@@ -45570,7 +44557,7 @@
           <w:sz w:val="24"/>
           <w:szCs w:val="24"/>
         </w:rPr>
-        <w:t xml:space="preserve">Indicateurs de fiabilité : erreur moyenne (MAE) sur le même mois de l'année précédente et en validation croisée, RMSE et R² ; la page Benchmark permet aussi d'importer un fichier Excel pour évaluer les modèles sur d'autres données.</w:t>
+        <w:t xml:space="preserve">Indicateurs de fiabilité : MAE, RMSE, R², MAPE et écart de volume mensuel en validation croisée ; la page Benchmark permet aussi d'importer un fichier Excel pour évaluer le modèle sur d'autres données.</w:t>
       </w:r>
     </w:p>
     <w:p>
@@ -46412,7 +45399,7 @@
           <w:sz w:val="24"/>
           <w:szCs w:val="24"/>
         </w:rPr>
-        <w:t xml:space="preserve">La validation des prévisions repose sur trois mesures complémentaires : la validation croisée sur 12 plis de 30 jours (du 01/04/2025 au 26/03/2026), qui donne l'erreur moyenne des modèles sur une année (67 927 à 94 635 unités par jour) ; la validation sur le même mois de l'année précédente, qui détermine le modèle utilisé (Random Forest pour mai 2026, avec 33 614 unités par jour d'erreur sur mai 2025) ; et le contrôle sur un mois réel : la prévision de février 2026, calculée avec les données au 31/01/2026, s'écarte de −4,5 % de la production réellement réalisée.</w:t>
+        <w:t xml:space="preserve">La validation des prévisions repose sur deux mesures complémentaires : la validation croisée sur 12 plis de 31 jours (du 20/03/2025 au 26/03/2026), qui donne l'erreur moyenne du modèle sur une année (57 079 unités par jour pour Random Forest, avec un écart de volume mensuel de 9,6 %) ; et le contrôle sur un mois réel : la prévision de février 2026, calculée avec les données au 31/01/2026, s'écarte de −9,4 % de la production réellement réalisée.</w:t>
       </w:r>
     </w:p>
     <w:p>
@@ -46933,7 +45920,7 @@
                 <w:sz w:val="18"/>
                 <w:szCs w:val="18"/>
               </w:rPr>
-              <w:t xml:space="preserve">Prévision mensuelle du meilleur modèle, comparaison avec l'année N-1 et avec le réel</w:t>
+              <w:t xml:space="preserve">Prévision mensuelle (Random Forest), comparaison avec l'année N-1 et avec le réel</w:t>
             </w:r>
           </w:p>
         </w:tc>
@@ -47263,7 +46250,7 @@
                 <w:sz w:val="18"/>
                 <w:szCs w:val="18"/>
               </w:rPr>
-              <w:t xml:space="preserve">Contrôle des prévisions (février 2026 : −4,5 %) et du plan de réapprovisionnement</w:t>
+              <w:t xml:space="preserve">Contrôle des prévisions (février 2026 : −9,4 %) et du plan de réapprovisionnement</w:t>
             </w:r>
           </w:p>
         </w:tc>
@@ -47612,7 +46599,7 @@
           <w:sz w:val="24"/>
           <w:szCs w:val="24"/>
         </w:rPr>
-        <w:t xml:space="preserve">Sprint 3 (Modélisation prédictive par IA) : comparaison de quatre modèles (Régression linéaire, ARIMA, Random Forest, Prophet) par validation croisée temporelle, réglage des hyperparamètres et sélection automatique du meilleur modèle sur le même mois de l'année précédente ; Random Forest est retenu pour mai 2026, et la prévision de février 2026 s'écarte de −4,5 % de la production réelle.</w:t>
+        <w:t xml:space="preserve">Sprint 3 (Modélisation prédictive par IA) : comparaison de quatre modèles (Régression linéaire, ARIMA, Random Forest, Prophet) par validation croisée temporelle sur six ans d'historique ; Random Forest, le plus précis (57 079 unités par jour d'erreur moyenne), prévoit le volume d'un mois à environ 10 % près et est retenu par l'application.</w:t>
       </w:r>
     </w:p>
     <w:p>
@@ -47737,7 +46724,7 @@
           <w:sz w:val="24"/>
           <w:szCs w:val="24"/>
         </w:rPr>
-        <w:t xml:space="preserve">Périmètre temporel d'observation : la modélisation exploite 816 jours (janvier 2024 à mars 2026), soit un peu plus de deux cycles annuels ; la validation sur l'année précédente ne porte donc que sur un mois, et le réglage des hyperparamètres ne s'est pas révélé généralisable sur cet historique. La forte variabilité journalière (coefficient de variation de 65 %) maintient l'erreur moyenne en validation croisée autour de 70 000 unités par jour (MAE).</w:t>
+        <w:t xml:space="preserve">Précision au jour près : malgré six ans d'historique (2020 à 2026), la forte variabilité journalière (coefficient de variation de 65 %) et les mois de fermeture limitent la précision quotidienne (erreur moyenne de 57 079 unités par jour) ; la prévision est plus fiable à l'échelle du mois (écart de volume d'environ 10 %).</w:t>
       </w:r>
     </w:p>
     <w:p>

</xml_diff>